<commit_message>
Fase 2: actualiza guías del estudiante 2.4 (Herrera y Hernández)
Co-Authored-By: Claude Opus 5.5 <noreply@anthropic.com>
</commit_message>
<xml_diff>
--- a/Fase 2/Individual/Hernandez_Johan_2.4_GuiaEstudiante_Fase2_DesarrolloProyectoAPT.docx
+++ b/Fase 2/Individual/Hernandez_Johan_2.4_GuiaEstudiante_Fase2_DesarrolloProyectoAPT.docx
@@ -1,11 +1,8 @@
 
 <file path=word/document.xml><?xml version="1.0" encoding="utf-8"?>
-<w:document xmlns:wpc="http://schemas.microsoft.com/office/word/2010/wordprocessingCanvas" xmlns:cx="http://schemas.microsoft.com/office/drawing/2014/chartex" xmlns:mc="http://schemas.openxmlformats.org/markup-compatibility/2006" xmlns:o="urn:schemas-microsoft-com:office:office" xmlns:r="http://schemas.openxmlformats.org/officeDocument/2006/relationships" xmlns:m="http://schemas.openxmlformats.org/officeDocument/2006/math" xmlns:v="urn:schemas-microsoft-com:vml" xmlns:wp14="http://schemas.microsoft.com/office/word/2010/wordprocessingDrawing" xmlns:wp="http://schemas.openxmlformats.org/drawingml/2006/wordprocessingDrawing" xmlns:w10="urn:schemas-microsoft-com:office:word" xmlns:w="http://schemas.openxmlformats.org/wordprocessingml/2006/main" xmlns:w14="http://schemas.microsoft.com/office/word/2010/wordml" xmlns:w15="http://schemas.microsoft.com/office/word/2012/wordml" xmlns:w16se="http://schemas.microsoft.com/office/word/2015/wordml/symex" xmlns:wpg="http://schemas.microsoft.com/office/word/2010/wordprocessingGroup" xmlns:wpi="http://schemas.microsoft.com/office/word/2010/wordprocessingInk" xmlns:wne="http://schemas.microsoft.com/office/word/2006/wordml" xmlns:wps="http://schemas.microsoft.com/office/word/2010/wordprocessingShape" mc:Ignorable="w14 w15 w16se wp14">
+<w:document xmlns:wpc="http://schemas.microsoft.com/office/word/2010/wordprocessingCanvas" xmlns:cx="http://schemas.microsoft.com/office/drawing/2014/chartex" xmlns:cx1="http://schemas.microsoft.com/office/drawing/2015/9/8/chartex" xmlns:cx2="http://schemas.microsoft.com/office/drawing/2015/10/21/chartex" xmlns:cx3="http://schemas.microsoft.com/office/drawing/2016/5/9/chartex" xmlns:cx4="http://schemas.microsoft.com/office/drawing/2016/5/10/chartex" xmlns:cx5="http://schemas.microsoft.com/office/drawing/2016/5/11/chartex" xmlns:cx6="http://schemas.microsoft.com/office/drawing/2016/5/12/chartex" xmlns:cx7="http://schemas.microsoft.com/office/drawing/2016/5/13/chartex" xmlns:cx8="http://schemas.microsoft.com/office/drawing/2016/5/14/chartex" xmlns:mc="http://schemas.openxmlformats.org/markup-compatibility/2006" xmlns:aink="http://schemas.microsoft.com/office/drawing/2016/ink" xmlns:am3d="http://schemas.microsoft.com/office/drawing/2017/model3d" xmlns:o="urn:schemas-microsoft-com:office:office" xmlns:oel="http://schemas.microsoft.com/office/2019/extlst" xmlns:r="http://schemas.openxmlformats.org/officeDocument/2006/relationships" xmlns:m="http://schemas.openxmlformats.org/officeDocument/2006/math" xmlns:v="urn:schemas-microsoft-com:vml" xmlns:wp14="http://schemas.microsoft.com/office/word/2010/wordprocessingDrawing" xmlns:wp="http://schemas.openxmlformats.org/drawingml/2006/wordprocessingDrawing" xmlns:w10="urn:schemas-microsoft-com:office:word" xmlns:w="http://schemas.openxmlformats.org/wordprocessingml/2006/main" xmlns:w14="http://schemas.microsoft.com/office/word/2010/wordml" xmlns:w15="http://schemas.microsoft.com/office/word/2012/wordml" xmlns:w16cex="http://schemas.microsoft.com/office/word/2018/wordml/cex" xmlns:w16cid="http://schemas.microsoft.com/office/word/2016/wordml/cid" xmlns:w16="http://schemas.microsoft.com/office/word/2018/wordml" xmlns:w16du="http://schemas.microsoft.com/office/word/2023/wordml/word16du" xmlns:w16sdtdh="http://schemas.microsoft.com/office/word/2020/wordml/sdtdatahash" xmlns:w16sdtfl="http://schemas.microsoft.com/office/word/2024/wordml/sdtformatlock" xmlns:w16se="http://schemas.microsoft.com/office/word/2015/wordml/symex" xmlns:wpg="http://schemas.microsoft.com/office/word/2010/wordprocessingGroup" xmlns:wpi="http://schemas.microsoft.com/office/word/2010/wordprocessingInk" xmlns:wne="http://schemas.microsoft.com/office/word/2006/wordml" xmlns:wps="http://schemas.microsoft.com/office/word/2010/wordprocessingShape" mc:Ignorable="w14 w15 w16se w16cid w16 w16cex w16sdtdh w16sdtfl w16du wp14">
   <w:body>
-    <w:p>
-      <w:bookmarkStart w:id="0" w:name="_GoBack"/>
-      <w:bookmarkEnd w:id="0"/>
-    </w:p>
+    <w:p/>
     <w:p>
       <w:pPr>
         <w:rPr>
@@ -165,6 +162,7 @@
                                 </w:rPr>
                                 <w:t xml:space="preserve">Asignatura </w:t>
                               </w:r>
+                              <w:proofErr w:type="spellStart"/>
                               <w:r>
                                 <w:rPr>
                                   <w:b/>
@@ -174,6 +172,7 @@
                                 </w:rPr>
                                 <w:t>Capstone</w:t>
                               </w:r>
+                              <w:proofErr w:type="spellEnd"/>
                             </w:p>
                           </w:txbxContent>
                         </wps:txbx>
@@ -512,35 +511,6 @@
           </w:p>
         </w:tc>
       </w:tr>
-      <w:tr>
-        <w:trPr>
-          <w:trHeight w:val="800"/>
-        </w:trPr>
-        <w:tc>
-          <w:tcPr>
-            <w:tcW w:w="9639" w:type="dxa"/>
-            <w:shd w:val="clear" w:color="auto" w:fill="D9E2F3" w:themeFill="accent1" w:themeFillTint="33"/>
-            <w:vAlign w:val="center"/>
-          </w:tcPr>
-          <w:p>
-            <w:pPr>
-              <w:pStyle w:val="Piedepgina"/>
-              <w:jc w:val="both"/>
-              <w:rPr>
-                <w:rFonts w:ascii="Calibri" w:hAnsi="Calibri"/>
-                <w:color w:val="1F3864" w:themeColor="accent1" w:themeShade="80"/>
-              </w:rPr>
-            </w:pPr>
-            <w:r>
-              <w:rPr>
-                <w:rFonts w:ascii="Calibri" w:hAnsi="Calibri"/>
-                <w:color w:val="1F3864" w:themeColor="accent1" w:themeShade="80"/>
-              </w:rPr>
-              <w:t xml:space="preserve">A continuación, encontrarás distintos campos que deberás completar con la información solicitada. </w:t>
-            </w:r>
-          </w:p>
-        </w:tc>
-      </w:tr>
     </w:tbl>
     <w:p>
       <w:pPr>
@@ -629,14 +599,39 @@
             <w:pPr>
               <w:jc w:val="both"/>
             </w:pPr>
-            <w:r/>
-            <w:r>
-              <w:rPr>
-                <w:rFonts w:ascii="Calibri" w:hAnsi="Calibri"/>
-                <w:b w:val="0"/>
-                <w:sz w:val="22"/>
-              </w:rPr>
-              <w:t>A la semana 9 se completaron la Fase 1 (Definición) y el Sprint 0 (preparación), y se cerró el Sprint 1 (usuarios y autenticación). SkateClub es un producto en desarrollo con una versión piloto publicada para pruebas (web en skateclub.cl y prueba cerrada en Google Play); en el marco del Capstone construimos su versión 1.0.</w:t>
+            <w:r>
+              <w:rPr>
+                <w:rFonts w:ascii="Calibri" w:hAnsi="Calibri"/>
+              </w:rPr>
+              <w:t xml:space="preserve">A la semana 9 se completaron la Fase 1 (Definición) y el Sprint 0 (preparación), y se cerró el Sprint 1 (usuarios y autenticación). </w:t>
+            </w:r>
+            <w:proofErr w:type="spellStart"/>
+            <w:r>
+              <w:rPr>
+                <w:rFonts w:ascii="Calibri" w:hAnsi="Calibri"/>
+              </w:rPr>
+              <w:t>SkateClub</w:t>
+            </w:r>
+            <w:proofErr w:type="spellEnd"/>
+            <w:r>
+              <w:rPr>
+                <w:rFonts w:ascii="Calibri" w:hAnsi="Calibri"/>
+              </w:rPr>
+              <w:t xml:space="preserve"> es un producto en desarrollo con una versión piloto publicada para pruebas (web en skateclub.cl y prueba cerrada en Google Play); en el marco del </w:t>
+            </w:r>
+            <w:proofErr w:type="spellStart"/>
+            <w:r>
+              <w:rPr>
+                <w:rFonts w:ascii="Calibri" w:hAnsi="Calibri"/>
+              </w:rPr>
+              <w:t>Capstone</w:t>
+            </w:r>
+            <w:proofErr w:type="spellEnd"/>
+            <w:r>
+              <w:rPr>
+                <w:rFonts w:ascii="Calibri" w:hAnsi="Calibri"/>
+              </w:rPr>
+              <w:t xml:space="preserve"> construimos su versión 1.0.</w:t>
             </w:r>
           </w:p>
           <w:p>
@@ -646,10 +641,50 @@
             <w:r>
               <w:rPr>
                 <w:rFonts w:ascii="Calibri" w:hAnsi="Calibri"/>
-                <w:b w:val="0"/>
-                <w:sz w:val="22"/>
-              </w:rPr>
-              <w:t>Actividades realizadas: elaboración del ERS, el Plan de Sprints, el Diseño y Arquitectura (UML, DER y contratos de API), el Plan de Pruebas, los Requisitos No Funcionales y el Manual de Despliegue; carga del Product Backlog en Jira (10 épicas y 26 historias); rediseño completo de la autenticación (contraseñas con bcrypt, tokens JWT con rotación y revocación y sesión persistente), autorización de administradores validada en la base de datos y cierre de las vulnerabilidades de suplantación de identidad; y una suite de 35 pruebas automatizadas (34 aprobadas, 1 omitida, 0 fallidas) ejecutada en Docker.</w:t>
+              </w:rPr>
+              <w:t xml:space="preserve">Actividades realizadas: elaboración del ERS, el Plan de </w:t>
+            </w:r>
+            <w:proofErr w:type="spellStart"/>
+            <w:r>
+              <w:rPr>
+                <w:rFonts w:ascii="Calibri" w:hAnsi="Calibri"/>
+              </w:rPr>
+              <w:t>Sprints</w:t>
+            </w:r>
+            <w:proofErr w:type="spellEnd"/>
+            <w:r>
+              <w:rPr>
+                <w:rFonts w:ascii="Calibri" w:hAnsi="Calibri"/>
+              </w:rPr>
+              <w:t xml:space="preserve">, el Diseño y Arquitectura (UML, DER y contratos de API), el Plan de Pruebas, los Requisitos No Funcionales y el Manual de Despliegue; carga del </w:t>
+            </w:r>
+            <w:proofErr w:type="spellStart"/>
+            <w:r>
+              <w:rPr>
+                <w:rFonts w:ascii="Calibri" w:hAnsi="Calibri"/>
+              </w:rPr>
+              <w:t>Product</w:t>
+            </w:r>
+            <w:proofErr w:type="spellEnd"/>
+            <w:r>
+              <w:rPr>
+                <w:rFonts w:ascii="Calibri" w:hAnsi="Calibri"/>
+              </w:rPr>
+              <w:t xml:space="preserve"> Backlog en Jira (10 épicas y 26 historias); rediseño completo de la autenticación (contraseñas con </w:t>
+            </w:r>
+            <w:proofErr w:type="spellStart"/>
+            <w:r>
+              <w:rPr>
+                <w:rFonts w:ascii="Calibri" w:hAnsi="Calibri"/>
+              </w:rPr>
+              <w:t>bcrypt</w:t>
+            </w:r>
+            <w:proofErr w:type="spellEnd"/>
+            <w:r>
+              <w:rPr>
+                <w:rFonts w:ascii="Calibri" w:hAnsi="Calibri"/>
+              </w:rPr>
+              <w:t>, tokens JWT con rotación y revocación y sesión persistente), autorización de administradores validada en la base de datos y cierre de las vulnerabilidades de suplantación de identidad; y una suite de 35 pruebas automatizadas (34 aprobadas, 1 omitida, 0 fallidas) ejecutada en Docker.</w:t>
             </w:r>
           </w:p>
           <w:p>
@@ -659,10 +694,22 @@
             <w:r>
               <w:rPr>
                 <w:rFonts w:ascii="Calibri" w:hAnsi="Calibri"/>
-                <w:b w:val="0"/>
-                <w:sz w:val="22"/>
-              </w:rPr>
-              <w:t>Objetivos específicos cumplidos: formalizar los requisitos y la arquitectura (logrado); construir y documentar el modelo de datos (logrado: PostgreSQL 15 + PostGIS con 32 tablas y 51 índices); consolidar el módulo de autenticación y perfiles (logrado, 1 de 5 módulos); plan de pruebas (en curso); plan de seguridad (remediación técnica ya ejecutada, documento formal pendiente para el informe final).</w:t>
+              </w:rPr>
+              <w:t xml:space="preserve">Objetivos específicos cumplidos: formalizar los requisitos y la arquitectura (logrado); construir y documentar el modelo de datos (logrado: PostgreSQL 15 + </w:t>
+            </w:r>
+            <w:proofErr w:type="spellStart"/>
+            <w:r>
+              <w:rPr>
+                <w:rFonts w:ascii="Calibri" w:hAnsi="Calibri"/>
+              </w:rPr>
+              <w:t>PostGIS</w:t>
+            </w:r>
+            <w:proofErr w:type="spellEnd"/>
+            <w:r>
+              <w:rPr>
+                <w:rFonts w:ascii="Calibri" w:hAnsi="Calibri"/>
+              </w:rPr>
+              <w:t xml:space="preserve"> con 32 tablas y 51 índices); consolidar el módulo de autenticación y perfiles (logrado, 1 de 5 módulos); plan de pruebas (en curso); plan de seguridad (remediación técnica ya ejecutada, documento formal pendiente para el informe final).</w:t>
             </w:r>
           </w:p>
           <w:p>
@@ -672,8 +719,6 @@
             <w:r>
               <w:rPr>
                 <w:rFonts w:ascii="Calibri" w:hAnsi="Calibri"/>
-                <w:b w:val="0"/>
-                <w:sz w:val="22"/>
               </w:rPr>
               <w:t>Sprint 1: siete historias finalizadas en Jira (HDU-01, 02, 03, 05, 22, 23 y 24), cada una con responsable y comentario de verificación; HDU-04 pasó al Sprint 2 por un criterio pendiente.</w:t>
             </w:r>
@@ -714,14 +759,25 @@
             <w:pPr>
               <w:jc w:val="both"/>
             </w:pPr>
-            <w:r/>
-            <w:r>
-              <w:rPr>
-                <w:rFonts w:ascii="Calibri" w:hAnsi="Calibri"/>
-                <w:b w:val="0"/>
-                <w:sz w:val="22"/>
-              </w:rPr>
-              <w:t>El objetivo general se mantiene; se precisó su enfoque a partir de la retroalimentación docente: SkateClub es un producto en desarrollo con una versión piloto, y el Proyecto APT desarrolla su versión 1.0 aplicando requisitos, arquitectura, modelo de datos, seguridad, pruebas y despliegue.</w:t>
+            <w:r>
+              <w:rPr>
+                <w:rFonts w:ascii="Calibri" w:hAnsi="Calibri"/>
+              </w:rPr>
+              <w:t xml:space="preserve">El objetivo general se mantiene; se precisó su enfoque a partir de la retroalimentación docente: </w:t>
+            </w:r>
+            <w:proofErr w:type="spellStart"/>
+            <w:r>
+              <w:rPr>
+                <w:rFonts w:ascii="Calibri" w:hAnsi="Calibri"/>
+              </w:rPr>
+              <w:t>SkateClub</w:t>
+            </w:r>
+            <w:proofErr w:type="spellEnd"/>
+            <w:r>
+              <w:rPr>
+                <w:rFonts w:ascii="Calibri" w:hAnsi="Calibri"/>
+              </w:rPr>
+              <w:t xml:space="preserve"> es un producto en desarrollo con una versión piloto, y el Proyecto APT desarrolla su versión 1.0 aplicando requisitos, arquitectura, modelo de datos, seguridad, pruebas y despliegue.</w:t>
             </w:r>
           </w:p>
           <w:p>
@@ -731,10 +787,51 @@
             <w:r>
               <w:rPr>
                 <w:rFonts w:ascii="Calibri" w:hAnsi="Calibri"/>
-                <w:b w:val="0"/>
-                <w:sz w:val="22"/>
-              </w:rPr>
-              <w:t>Ajuste a un objetivo específico: «contenerizar y desplegar el sistema» se cumple con despliegue en la nube en Vercel (serverless), mientras que Docker se utiliza como entorno local reproducible para desarrollo y pruebas.</w:t>
+              </w:rPr>
+              <w:lastRenderedPageBreak/>
+              <w:t>Ajuste a un objetivo específico: «</w:t>
+            </w:r>
+            <w:proofErr w:type="spellStart"/>
+            <w:r>
+              <w:rPr>
+                <w:rFonts w:ascii="Calibri" w:hAnsi="Calibri"/>
+              </w:rPr>
+              <w:t>contenerizar</w:t>
+            </w:r>
+            <w:proofErr w:type="spellEnd"/>
+            <w:r>
+              <w:rPr>
+                <w:rFonts w:ascii="Calibri" w:hAnsi="Calibri"/>
+              </w:rPr>
+              <w:t xml:space="preserve"> y desplegar el sistema» se cumple con despliegue en la nube en </w:t>
+            </w:r>
+            <w:proofErr w:type="spellStart"/>
+            <w:r>
+              <w:rPr>
+                <w:rFonts w:ascii="Calibri" w:hAnsi="Calibri"/>
+              </w:rPr>
+              <w:t>Vercel</w:t>
+            </w:r>
+            <w:proofErr w:type="spellEnd"/>
+            <w:r>
+              <w:rPr>
+                <w:rFonts w:ascii="Calibri" w:hAnsi="Calibri"/>
+              </w:rPr>
+              <w:t xml:space="preserve"> (</w:t>
+            </w:r>
+            <w:proofErr w:type="spellStart"/>
+            <w:r>
+              <w:rPr>
+                <w:rFonts w:ascii="Calibri" w:hAnsi="Calibri"/>
+              </w:rPr>
+              <w:t>serverless</w:t>
+            </w:r>
+            <w:proofErr w:type="spellEnd"/>
+            <w:r>
+              <w:rPr>
+                <w:rFonts w:ascii="Calibri" w:hAnsi="Calibri"/>
+              </w:rPr>
+              <w:t>), mientras que Docker se utiliza como entorno local reproducible para desarrollo y pruebas.</w:t>
             </w:r>
           </w:p>
         </w:tc>
@@ -760,6 +857,7 @@
                 <w:rFonts w:ascii="Calibri" w:hAnsi="Calibri"/>
                 <w:color w:val="1F3864" w:themeColor="accent1" w:themeShade="80"/>
               </w:rPr>
+              <w:lastRenderedPageBreak/>
               <w:t>Metodología</w:t>
             </w:r>
           </w:p>
@@ -773,12 +871,9 @@
             <w:pPr>
               <w:jc w:val="both"/>
             </w:pPr>
-            <w:r/>
-            <w:r>
-              <w:rPr>
-                <w:rFonts w:ascii="Calibri" w:hAnsi="Calibri"/>
-                <w:b w:val="0"/>
-                <w:sz w:val="22"/>
+            <w:r>
+              <w:rPr>
+                <w:rFonts w:ascii="Calibri" w:hAnsi="Calibri"/>
               </w:rPr>
               <w:t>Se mantiene Scrum con Jira y prácticas DevOps. Ajustes:</w:t>
             </w:r>
@@ -790,10 +885,22 @@
             <w:r>
               <w:rPr>
                 <w:rFonts w:ascii="Calibri" w:hAnsi="Calibri"/>
-                <w:b w:val="0"/>
-                <w:sz w:val="22"/>
-              </w:rPr>
-              <w:t>• Sprint 1 extendido una semana (21-09 a 11-10) y sprints restantes de una semana para llegar al informe final del 06-11-2026.</w:t>
+              </w:rPr>
+              <w:t xml:space="preserve">• Sprint 1 extendido una semana (21-09 a 11-10) y </w:t>
+            </w:r>
+            <w:proofErr w:type="spellStart"/>
+            <w:r>
+              <w:rPr>
+                <w:rFonts w:ascii="Calibri" w:hAnsi="Calibri"/>
+              </w:rPr>
+              <w:t>sprints</w:t>
+            </w:r>
+            <w:proofErr w:type="spellEnd"/>
+            <w:r>
+              <w:rPr>
+                <w:rFonts w:ascii="Calibri" w:hAnsi="Calibri"/>
+              </w:rPr>
+              <w:t xml:space="preserve"> restantes de una semana para llegar al informe final del 06-11-2026.</w:t>
             </w:r>
           </w:p>
           <w:p>
@@ -803,8 +910,6 @@
             <w:r>
               <w:rPr>
                 <w:rFonts w:ascii="Calibri" w:hAnsi="Calibri"/>
-                <w:b w:val="0"/>
-                <w:sz w:val="22"/>
               </w:rPr>
               <w:t>• Definición de Terminado explícita: una historia solo se cierra con todos sus criterios verificados, el código integrado, las pruebas o verificación documentadas y la evidencia en Jira.</w:t>
             </w:r>
@@ -816,10 +921,22 @@
             <w:r>
               <w:rPr>
                 <w:rFonts w:ascii="Calibri" w:hAnsi="Calibri"/>
-                <w:b w:val="0"/>
-                <w:sz w:val="22"/>
-              </w:rPr>
-              <w:t>• Trazabilidad: desde el Sprint 2 cada commit referencia su historia de Jira (SCRUM-XX).</w:t>
+              </w:rPr>
+              <w:t xml:space="preserve">• Trazabilidad: desde el Sprint 2 cada </w:t>
+            </w:r>
+            <w:proofErr w:type="spellStart"/>
+            <w:r>
+              <w:rPr>
+                <w:rFonts w:ascii="Calibri" w:hAnsi="Calibri"/>
+              </w:rPr>
+              <w:t>commit</w:t>
+            </w:r>
+            <w:proofErr w:type="spellEnd"/>
+            <w:r>
+              <w:rPr>
+                <w:rFonts w:ascii="Calibri" w:hAnsi="Calibri"/>
+              </w:rPr>
+              <w:t xml:space="preserve"> referencia su historia de Jira (SCRUM-XX).</w:t>
             </w:r>
           </w:p>
           <w:p>
@@ -829,10 +946,50 @@
             <w:r>
               <w:rPr>
                 <w:rFonts w:ascii="Calibri" w:hAnsi="Calibri"/>
-                <w:b w:val="0"/>
-                <w:sz w:val="22"/>
-              </w:rPr>
-              <w:t>• Repositorios: el código vive en repositorios privados (backend y frontend) y la documentación y evidencias en el repositorio público del Capstone.</w:t>
+              </w:rPr>
+              <w:t>• Repositorios: el código vive en repositorios privados (</w:t>
+            </w:r>
+            <w:proofErr w:type="spellStart"/>
+            <w:r>
+              <w:rPr>
+                <w:rFonts w:ascii="Calibri" w:hAnsi="Calibri"/>
+              </w:rPr>
+              <w:t>backend</w:t>
+            </w:r>
+            <w:proofErr w:type="spellEnd"/>
+            <w:r>
+              <w:rPr>
+                <w:rFonts w:ascii="Calibri" w:hAnsi="Calibri"/>
+              </w:rPr>
+              <w:t xml:space="preserve"> y </w:t>
+            </w:r>
+            <w:proofErr w:type="spellStart"/>
+            <w:r>
+              <w:rPr>
+                <w:rFonts w:ascii="Calibri" w:hAnsi="Calibri"/>
+              </w:rPr>
+              <w:t>frontend</w:t>
+            </w:r>
+            <w:proofErr w:type="spellEnd"/>
+            <w:r>
+              <w:rPr>
+                <w:rFonts w:ascii="Calibri" w:hAnsi="Calibri"/>
+              </w:rPr>
+              <w:t xml:space="preserve">) y la documentación y evidencias en el repositorio público del </w:t>
+            </w:r>
+            <w:proofErr w:type="spellStart"/>
+            <w:r>
+              <w:rPr>
+                <w:rFonts w:ascii="Calibri" w:hAnsi="Calibri"/>
+              </w:rPr>
+              <w:t>Capstone</w:t>
+            </w:r>
+            <w:proofErr w:type="spellEnd"/>
+            <w:r>
+              <w:rPr>
+                <w:rFonts w:ascii="Calibri" w:hAnsi="Calibri"/>
+              </w:rPr>
+              <w:t>.</w:t>
             </w:r>
           </w:p>
         </w:tc>
@@ -871,14 +1028,39 @@
             <w:pPr>
               <w:jc w:val="both"/>
             </w:pPr>
-            <w:r/>
-            <w:r>
-              <w:rPr>
-                <w:rFonts w:ascii="Calibri" w:hAnsi="Calibri"/>
-                <w:b w:val="0"/>
-                <w:sz w:val="22"/>
-              </w:rPr>
-              <w:t>Las evidencias se resguardan en el repositorio público (github.com/Johanhzzz/Skateclub-capstone-docs, carpeta Fase 2/Evidencias) y en Jira:</w:t>
+            <w:r>
+              <w:rPr>
+                <w:rFonts w:ascii="Calibri" w:hAnsi="Calibri"/>
+              </w:rPr>
+              <w:t>Las evidencias se resguardan en el repositorio público (github.com/</w:t>
+            </w:r>
+            <w:proofErr w:type="spellStart"/>
+            <w:r>
+              <w:rPr>
+                <w:rFonts w:ascii="Calibri" w:hAnsi="Calibri"/>
+              </w:rPr>
+              <w:t>Johanhzzz</w:t>
+            </w:r>
+            <w:proofErr w:type="spellEnd"/>
+            <w:r>
+              <w:rPr>
+                <w:rFonts w:ascii="Calibri" w:hAnsi="Calibri"/>
+              </w:rPr>
+              <w:t>/</w:t>
+            </w:r>
+            <w:proofErr w:type="spellStart"/>
+            <w:r>
+              <w:rPr>
+                <w:rFonts w:ascii="Calibri" w:hAnsi="Calibri"/>
+              </w:rPr>
+              <w:t>Skateclub-capstone-docs</w:t>
+            </w:r>
+            <w:proofErr w:type="spellEnd"/>
+            <w:r>
+              <w:rPr>
+                <w:rFonts w:ascii="Calibri" w:hAnsi="Calibri"/>
+              </w:rPr>
+              <w:t>, carpeta Fase 2/Evidencias) y en Jira:</w:t>
             </w:r>
           </w:p>
           <w:p>
@@ -888,8 +1070,6 @@
             <w:r>
               <w:rPr>
                 <w:rFonts w:ascii="Calibri" w:hAnsi="Calibri"/>
-                <w:b w:val="0"/>
-                <w:sz w:val="22"/>
               </w:rPr>
               <w:t>• Informe de Avance Fase 2 v2.0: documento grupal con el detalle completo.</w:t>
             </w:r>
@@ -901,10 +1081,22 @@
             <w:r>
               <w:rPr>
                 <w:rFonts w:ascii="Calibri" w:hAnsi="Calibri"/>
-                <w:b w:val="0"/>
-                <w:sz w:val="22"/>
-              </w:rPr>
-              <w:t>• Jira: Sprint 1 cerrado con siete historias finalizadas, responsable asignado y comentario de verificación por historia (criterios, commits y pruebas); Sprint 2 iniciado. Evidencia la gestión ágil del proyecto.</w:t>
+              </w:rPr>
+              <w:t xml:space="preserve">• Jira: Sprint 1 cerrado con siete historias finalizadas, responsable asignado y comentario de verificación por historia (criterios, </w:t>
+            </w:r>
+            <w:proofErr w:type="spellStart"/>
+            <w:r>
+              <w:rPr>
+                <w:rFonts w:ascii="Calibri" w:hAnsi="Calibri"/>
+              </w:rPr>
+              <w:t>commits</w:t>
+            </w:r>
+            <w:proofErr w:type="spellEnd"/>
+            <w:r>
+              <w:rPr>
+                <w:rFonts w:ascii="Calibri" w:hAnsi="Calibri"/>
+              </w:rPr>
+              <w:t xml:space="preserve"> y pruebas); Sprint 2 iniciado. Evidencia la gestión ágil del proyecto.</w:t>
             </w:r>
           </w:p>
           <w:p>
@@ -914,10 +1106,36 @@
             <w:r>
               <w:rPr>
                 <w:rFonts w:ascii="Calibri" w:hAnsi="Calibri"/>
-                <w:b w:val="0"/>
-                <w:sz w:val="22"/>
-              </w:rPr>
-              <w:t>• Programación: tabla de trazabilidad historia → implementación → commit y capturas de la aplicación publicada (inicio de sesión y perfil skater). Evidencia el desarrollo e integración de la solución.</w:t>
+              </w:rPr>
+              <w:t xml:space="preserve">• Programación: tabla de trazabilidad historia → implementación → </w:t>
+            </w:r>
+            <w:proofErr w:type="spellStart"/>
+            <w:r>
+              <w:rPr>
+                <w:rFonts w:ascii="Calibri" w:hAnsi="Calibri"/>
+              </w:rPr>
+              <w:t>commit</w:t>
+            </w:r>
+            <w:proofErr w:type="spellEnd"/>
+            <w:r>
+              <w:rPr>
+                <w:rFonts w:ascii="Calibri" w:hAnsi="Calibri"/>
+              </w:rPr>
+              <w:t xml:space="preserve"> y capturas de la aplicación publicada (inicio de sesión y perfil </w:t>
+            </w:r>
+            <w:proofErr w:type="spellStart"/>
+            <w:r>
+              <w:rPr>
+                <w:rFonts w:ascii="Calibri" w:hAnsi="Calibri"/>
+              </w:rPr>
+              <w:t>skater</w:t>
+            </w:r>
+            <w:proofErr w:type="spellEnd"/>
+            <w:r>
+              <w:rPr>
+                <w:rFonts w:ascii="Calibri" w:hAnsi="Calibri"/>
+              </w:rPr>
+              <w:t>). Evidencia el desarrollo e integración de la solución.</w:t>
             </w:r>
           </w:p>
           <w:p>
@@ -927,10 +1145,22 @@
             <w:r>
               <w:rPr>
                 <w:rFonts w:ascii="Calibri" w:hAnsi="Calibri"/>
-                <w:b w:val="0"/>
-                <w:sz w:val="22"/>
-              </w:rPr>
-              <w:t>• Almacenamiento de datos: modelo entidad-relación y base PostgreSQL 15 + PostGIS 3.3.7 con 32 tablas, 51 índices y RLS activado. Evidencia la construcción del modelo de datos.</w:t>
+              </w:rPr>
+              <w:t xml:space="preserve">• Almacenamiento de datos: modelo entidad-relación y base PostgreSQL 15 + </w:t>
+            </w:r>
+            <w:proofErr w:type="spellStart"/>
+            <w:r>
+              <w:rPr>
+                <w:rFonts w:ascii="Calibri" w:hAnsi="Calibri"/>
+              </w:rPr>
+              <w:t>PostGIS</w:t>
+            </w:r>
+            <w:proofErr w:type="spellEnd"/>
+            <w:r>
+              <w:rPr>
+                <w:rFonts w:ascii="Calibri" w:hAnsi="Calibri"/>
+              </w:rPr>
+              <w:t xml:space="preserve"> 3.3.7 con 32 tablas, 51 índices y RLS activado. Evidencia la construcción del modelo de datos.</w:t>
             </w:r>
           </w:p>
           <w:p>
@@ -940,8 +1170,6 @@
             <w:r>
               <w:rPr>
                 <w:rFonts w:ascii="Calibri" w:hAnsi="Calibri"/>
-                <w:b w:val="0"/>
-                <w:sz w:val="22"/>
               </w:rPr>
               <w:t>• Pruebas: registro de la suite automatizada ejecutada en Docker (35 casos: 34 aprobados, 1 omitido, 0 fallidos). Evidencia el aseguramiento de la calidad.</w:t>
             </w:r>
@@ -953,10 +1181,64 @@
             <w:r>
               <w:rPr>
                 <w:rFonts w:ascii="Calibri" w:hAnsi="Calibri"/>
-                <w:b w:val="0"/>
-                <w:sz w:val="22"/>
-              </w:rPr>
-              <w:t>Resguardo de la calidad: aplicamos Scrum con una Definición de Terminado estricta, pruebas automatizadas contra una base de datos real (sin dobles, porque la autorización depende de la base), commits convencionales, Pull Requests e integración y despliegue continuos del frontend. Las propias pruebas detectaron cuatro grupos de endpoints sin verificación de identidad, que corregimos antes de cerrar el sprint.</w:t>
+              </w:rPr>
+              <w:t xml:space="preserve">Resguardo de la calidad: aplicamos Scrum con una Definición de Terminado estricta, pruebas automatizadas contra una base de datos real (sin dobles, porque la autorización depende de la base), </w:t>
+            </w:r>
+            <w:proofErr w:type="spellStart"/>
+            <w:r>
+              <w:rPr>
+                <w:rFonts w:ascii="Calibri" w:hAnsi="Calibri"/>
+              </w:rPr>
+              <w:t>commits</w:t>
+            </w:r>
+            <w:proofErr w:type="spellEnd"/>
+            <w:r>
+              <w:rPr>
+                <w:rFonts w:ascii="Calibri" w:hAnsi="Calibri"/>
+              </w:rPr>
+              <w:t xml:space="preserve"> convencionales, Pull </w:t>
+            </w:r>
+            <w:proofErr w:type="spellStart"/>
+            <w:r>
+              <w:rPr>
+                <w:rFonts w:ascii="Calibri" w:hAnsi="Calibri"/>
+              </w:rPr>
+              <w:t>Requests</w:t>
+            </w:r>
+            <w:proofErr w:type="spellEnd"/>
+            <w:r>
+              <w:rPr>
+                <w:rFonts w:ascii="Calibri" w:hAnsi="Calibri"/>
+              </w:rPr>
+              <w:t xml:space="preserve"> e integración y despliegue continuos del </w:t>
+            </w:r>
+            <w:proofErr w:type="spellStart"/>
+            <w:r>
+              <w:rPr>
+                <w:rFonts w:ascii="Calibri" w:hAnsi="Calibri"/>
+              </w:rPr>
+              <w:t>frontend</w:t>
+            </w:r>
+            <w:proofErr w:type="spellEnd"/>
+            <w:r>
+              <w:rPr>
+                <w:rFonts w:ascii="Calibri" w:hAnsi="Calibri"/>
+              </w:rPr>
+              <w:t xml:space="preserve">. Las propias pruebas detectaron cuatro grupos de </w:t>
+            </w:r>
+            <w:proofErr w:type="spellStart"/>
+            <w:r>
+              <w:rPr>
+                <w:rFonts w:ascii="Calibri" w:hAnsi="Calibri"/>
+              </w:rPr>
+              <w:t>endpoints</w:t>
+            </w:r>
+            <w:proofErr w:type="spellEnd"/>
+            <w:r>
+              <w:rPr>
+                <w:rFonts w:ascii="Calibri" w:hAnsi="Calibri"/>
+              </w:rPr>
+              <w:t xml:space="preserve"> sin verificación de identidad, que corregimos antes de cerrar el sprint.</w:t>
             </w:r>
           </w:p>
         </w:tc>
@@ -1025,48 +1307,6 @@
                 <w:szCs w:val="28"/>
               </w:rPr>
               <w:t xml:space="preserve">Monitoreo del Plan de Trabajo </w:t>
-            </w:r>
-          </w:p>
-        </w:tc>
-      </w:tr>
-      <w:tr>
-        <w:trPr>
-          <w:trHeight w:val="800"/>
-        </w:trPr>
-        <w:tc>
-          <w:tcPr>
-            <w:tcW w:w="9640" w:type="dxa"/>
-            <w:shd w:val="clear" w:color="auto" w:fill="D9E2F3" w:themeFill="accent1" w:themeFillTint="33"/>
-            <w:vAlign w:val="center"/>
-          </w:tcPr>
-          <w:p>
-            <w:pPr>
-              <w:jc w:val="both"/>
-              <w:rPr>
-                <w:rFonts w:ascii="Calibri" w:hAnsi="Calibri"/>
-                <w:color w:val="1F3864" w:themeColor="accent1" w:themeShade="80"/>
-              </w:rPr>
-            </w:pPr>
-            <w:r>
-              <w:rPr>
-                <w:rFonts w:ascii="Calibri" w:hAnsi="Calibri"/>
-                <w:color w:val="1F3864" w:themeColor="accent1" w:themeShade="80"/>
-              </w:rPr>
-              <w:t xml:space="preserve">Examina cuidadosamente tu plan de trabajo, enfocándote especialmente en la columna de </w:t>
-            </w:r>
-            <w:r>
-              <w:rPr>
-                <w:rFonts w:ascii="Calibri" w:hAnsi="Calibri"/>
-                <w:color w:val="1F3864" w:themeColor="accent1" w:themeShade="80"/>
-              </w:rPr>
-              <w:t xml:space="preserve">estado de avance </w:t>
-            </w:r>
-            <w:r>
-              <w:rPr>
-                <w:rFonts w:ascii="Calibri" w:hAnsi="Calibri"/>
-                <w:color w:val="1F3864" w:themeColor="accent1" w:themeShade="80"/>
-              </w:rPr>
-              <w:t>y ajustes.</w:t>
             </w:r>
           </w:p>
         </w:tc>
@@ -1379,11 +1619,9 @@
             <w:tcW w:w="1328" w:type="dxa"/>
           </w:tcPr>
           <w:p>
-            <w:r/>
-            <w:r>
-              <w:rPr>
-                <w:rFonts w:ascii="Calibri" w:hAnsi="Calibri"/>
-                <w:b w:val="0"/>
+            <w:r>
+              <w:rPr>
+                <w:rFonts w:ascii="Calibri" w:hAnsi="Calibri"/>
                 <w:sz w:val="18"/>
               </w:rPr>
               <w:t>C2</w:t>
@@ -1395,11 +1633,9 @@
             <w:tcW w:w="1077" w:type="dxa"/>
           </w:tcPr>
           <w:p>
-            <w:r/>
-            <w:r>
-              <w:rPr>
-                <w:rFonts w:ascii="Calibri" w:hAnsi="Calibri"/>
-                <w:b w:val="0"/>
+            <w:r>
+              <w:rPr>
+                <w:rFonts w:ascii="Calibri" w:hAnsi="Calibri"/>
                 <w:sz w:val="18"/>
               </w:rPr>
               <w:t>Definición del proyecto (Fase 1)</w:t>
@@ -1411,11 +1647,9 @@
             <w:tcW w:w="1276" w:type="dxa"/>
           </w:tcPr>
           <w:p>
-            <w:r/>
-            <w:r>
-              <w:rPr>
-                <w:rFonts w:ascii="Calibri" w:hAnsi="Calibri"/>
-                <w:b w:val="0"/>
+            <w:r>
+              <w:rPr>
+                <w:rFonts w:ascii="Calibri" w:hAnsi="Calibri"/>
                 <w:sz w:val="18"/>
               </w:rPr>
               <w:t>Plantillas Duoc</w:t>
@@ -1427,14 +1661,28 @@
             <w:tcW w:w="1276" w:type="dxa"/>
           </w:tcPr>
           <w:p>
-            <w:r/>
-            <w:r>
-              <w:rPr>
-                <w:rFonts w:ascii="Calibri" w:hAnsi="Calibri"/>
-                <w:b w:val="0"/>
-                <w:sz w:val="18"/>
-              </w:rPr>
-              <w:t>4 sem.</w:t>
+            <w:r>
+              <w:rPr>
+                <w:rFonts w:ascii="Calibri" w:hAnsi="Calibri"/>
+                <w:sz w:val="18"/>
+              </w:rPr>
+              <w:t xml:space="preserve">4 </w:t>
+            </w:r>
+            <w:proofErr w:type="spellStart"/>
+            <w:r>
+              <w:rPr>
+                <w:rFonts w:ascii="Calibri" w:hAnsi="Calibri"/>
+                <w:sz w:val="18"/>
+              </w:rPr>
+              <w:t>sem</w:t>
+            </w:r>
+            <w:proofErr w:type="spellEnd"/>
+            <w:r>
+              <w:rPr>
+                <w:rFonts w:ascii="Calibri" w:hAnsi="Calibri"/>
+                <w:sz w:val="18"/>
+              </w:rPr>
+              <w:t>.</w:t>
             </w:r>
           </w:p>
         </w:tc>
@@ -1443,11 +1691,9 @@
             <w:tcW w:w="1275" w:type="dxa"/>
           </w:tcPr>
           <w:p>
-            <w:r/>
-            <w:r>
-              <w:rPr>
-                <w:rFonts w:ascii="Calibri" w:hAnsi="Calibri"/>
-                <w:b w:val="0"/>
+            <w:r>
+              <w:rPr>
+                <w:rFonts w:ascii="Calibri" w:hAnsi="Calibri"/>
                 <w:sz w:val="18"/>
               </w:rPr>
               <w:t>Johan · Álvaro</w:t>
@@ -1459,11 +1705,9 @@
             <w:tcW w:w="1276" w:type="dxa"/>
           </w:tcPr>
           <w:p>
-            <w:r/>
-            <w:r>
-              <w:rPr>
-                <w:rFonts w:ascii="Calibri" w:hAnsi="Calibri"/>
-                <w:b w:val="0"/>
+            <w:r>
+              <w:rPr>
+                <w:rFonts w:ascii="Calibri" w:hAnsi="Calibri"/>
                 <w:sz w:val="18"/>
               </w:rPr>
               <w:t>Facilitador: versión piloto disponible.</w:t>
@@ -1475,11 +1719,9 @@
             <w:tcW w:w="1418" w:type="dxa"/>
           </w:tcPr>
           <w:p>
-            <w:r/>
-            <w:r>
-              <w:rPr>
-                <w:rFonts w:ascii="Calibri" w:hAnsi="Calibri"/>
-                <w:b w:val="0"/>
+            <w:r>
+              <w:rPr>
+                <w:rFonts w:ascii="Calibri" w:hAnsi="Calibri"/>
                 <w:sz w:val="18"/>
               </w:rPr>
               <w:t>Completado</w:t>
@@ -1491,11 +1733,9 @@
             <w:tcW w:w="850" w:type="dxa"/>
           </w:tcPr>
           <w:p>
-            <w:r/>
-            <w:r>
-              <w:rPr>
-                <w:rFonts w:ascii="Calibri" w:hAnsi="Calibri"/>
-                <w:b w:val="0"/>
+            <w:r>
+              <w:rPr>
+                <w:rFonts w:ascii="Calibri" w:hAnsi="Calibri"/>
                 <w:sz w:val="18"/>
               </w:rPr>
               <w:t>Enfoque precisado</w:t>
@@ -1506,14 +1746,12 @@
       <w:tr>
         <w:tc>
           <w:tcPr>
-            <w:tcW w:type="dxa" w:w="1328"/>
-          </w:tcPr>
-          <w:p>
-            <w:r/>
-            <w:r>
-              <w:rPr>
-                <w:rFonts w:ascii="Calibri" w:hAnsi="Calibri"/>
-                <w:b w:val="0"/>
+            <w:tcW w:w="1328" w:type="dxa"/>
+          </w:tcPr>
+          <w:p>
+            <w:r>
+              <w:rPr>
+                <w:rFonts w:ascii="Calibri" w:hAnsi="Calibri"/>
                 <w:sz w:val="18"/>
               </w:rPr>
               <w:t>Arquitectura</w:t>
@@ -1522,14 +1760,12 @@
         </w:tc>
         <w:tc>
           <w:tcPr>
-            <w:tcW w:type="dxa" w:w="1077"/>
-          </w:tcPr>
-          <w:p>
-            <w:r/>
-            <w:r>
-              <w:rPr>
-                <w:rFonts w:ascii="Calibri" w:hAnsi="Calibri"/>
-                <w:b w:val="0"/>
+            <w:tcW w:w="1077" w:type="dxa"/>
+          </w:tcPr>
+          <w:p>
+            <w:r>
+              <w:rPr>
+                <w:rFonts w:ascii="Calibri" w:hAnsi="Calibri"/>
                 <w:sz w:val="18"/>
               </w:rPr>
               <w:t>Sprint 0: documentación, backlog y entorno</w:t>
@@ -1538,14 +1774,12 @@
         </w:tc>
         <w:tc>
           <w:tcPr>
-            <w:tcW w:type="dxa" w:w="1276"/>
-          </w:tcPr>
-          <w:p>
-            <w:r/>
-            <w:r>
-              <w:rPr>
-                <w:rFonts w:ascii="Calibri" w:hAnsi="Calibri"/>
-                <w:b w:val="0"/>
+            <w:tcW w:w="1276" w:type="dxa"/>
+          </w:tcPr>
+          <w:p>
+            <w:r>
+              <w:rPr>
+                <w:rFonts w:ascii="Calibri" w:hAnsi="Calibri"/>
                 <w:sz w:val="18"/>
               </w:rPr>
               <w:t>Jira, GitHub, Docker</w:t>
@@ -1554,30 +1788,42 @@
         </w:tc>
         <w:tc>
           <w:tcPr>
-            <w:tcW w:type="dxa" w:w="1276"/>
-          </w:tcPr>
-          <w:p>
-            <w:r/>
-            <w:r>
-              <w:rPr>
-                <w:rFonts w:ascii="Calibri" w:hAnsi="Calibri"/>
-                <w:b w:val="0"/>
-                <w:sz w:val="18"/>
-              </w:rPr>
-              <w:t>2 sem.</w:t>
-            </w:r>
-          </w:p>
-        </w:tc>
-        <w:tc>
-          <w:tcPr>
-            <w:tcW w:type="dxa" w:w="1275"/>
-          </w:tcPr>
-          <w:p>
-            <w:r/>
-            <w:r>
-              <w:rPr>
-                <w:rFonts w:ascii="Calibri" w:hAnsi="Calibri"/>
-                <w:b w:val="0"/>
+            <w:tcW w:w="1276" w:type="dxa"/>
+          </w:tcPr>
+          <w:p>
+            <w:r>
+              <w:rPr>
+                <w:rFonts w:ascii="Calibri" w:hAnsi="Calibri"/>
+                <w:sz w:val="18"/>
+              </w:rPr>
+              <w:t xml:space="preserve">2 </w:t>
+            </w:r>
+            <w:proofErr w:type="spellStart"/>
+            <w:r>
+              <w:rPr>
+                <w:rFonts w:ascii="Calibri" w:hAnsi="Calibri"/>
+                <w:sz w:val="18"/>
+              </w:rPr>
+              <w:t>sem</w:t>
+            </w:r>
+            <w:proofErr w:type="spellEnd"/>
+            <w:r>
+              <w:rPr>
+                <w:rFonts w:ascii="Calibri" w:hAnsi="Calibri"/>
+                <w:sz w:val="18"/>
+              </w:rPr>
+              <w:t>.</w:t>
+            </w:r>
+          </w:p>
+        </w:tc>
+        <w:tc>
+          <w:tcPr>
+            <w:tcW w:w="1275" w:type="dxa"/>
+          </w:tcPr>
+          <w:p>
+            <w:r>
+              <w:rPr>
+                <w:rFonts w:ascii="Calibri" w:hAnsi="Calibri"/>
                 <w:sz w:val="18"/>
               </w:rPr>
               <w:t>Johan · Álvaro</w:t>
@@ -1586,30 +1832,42 @@
         </w:tc>
         <w:tc>
           <w:tcPr>
-            <w:tcW w:type="dxa" w:w="1276"/>
-          </w:tcPr>
-          <w:p>
-            <w:r/>
-            <w:r>
-              <w:rPr>
-                <w:rFonts w:ascii="Calibri" w:hAnsi="Calibri"/>
-                <w:b w:val="0"/>
-                <w:sz w:val="18"/>
-              </w:rPr>
-              <w:t>Facilitador: stack conocido.</w:t>
-            </w:r>
-          </w:p>
-        </w:tc>
-        <w:tc>
-          <w:tcPr>
-            <w:tcW w:type="dxa" w:w="1418"/>
-          </w:tcPr>
-          <w:p>
-            <w:r/>
-            <w:r>
-              <w:rPr>
-                <w:rFonts w:ascii="Calibri" w:hAnsi="Calibri"/>
-                <w:b w:val="0"/>
+            <w:tcW w:w="1276" w:type="dxa"/>
+          </w:tcPr>
+          <w:p>
+            <w:r>
+              <w:rPr>
+                <w:rFonts w:ascii="Calibri" w:hAnsi="Calibri"/>
+                <w:sz w:val="18"/>
+              </w:rPr>
+              <w:t xml:space="preserve">Facilitador: </w:t>
+            </w:r>
+            <w:proofErr w:type="spellStart"/>
+            <w:r>
+              <w:rPr>
+                <w:rFonts w:ascii="Calibri" w:hAnsi="Calibri"/>
+                <w:sz w:val="18"/>
+              </w:rPr>
+              <w:t>stack</w:t>
+            </w:r>
+            <w:proofErr w:type="spellEnd"/>
+            <w:r>
+              <w:rPr>
+                <w:rFonts w:ascii="Calibri" w:hAnsi="Calibri"/>
+                <w:sz w:val="18"/>
+              </w:rPr>
+              <w:t xml:space="preserve"> conocido.</w:t>
+            </w:r>
+          </w:p>
+        </w:tc>
+        <w:tc>
+          <w:tcPr>
+            <w:tcW w:w="1418" w:type="dxa"/>
+          </w:tcPr>
+          <w:p>
+            <w:r>
+              <w:rPr>
+                <w:rFonts w:ascii="Calibri" w:hAnsi="Calibri"/>
                 <w:sz w:val="18"/>
               </w:rPr>
               <w:t>Completado</w:t>
@@ -1618,14 +1876,12 @@
         </w:tc>
         <w:tc>
           <w:tcPr>
-            <w:tcW w:type="dxa" w:w="850"/>
-          </w:tcPr>
-          <w:p>
-            <w:r/>
-            <w:r>
-              <w:rPr>
-                <w:rFonts w:ascii="Calibri" w:hAnsi="Calibri"/>
-                <w:b w:val="0"/>
+            <w:tcW w:w="850" w:type="dxa"/>
+          </w:tcPr>
+          <w:p>
+            <w:r>
+              <w:rPr>
+                <w:rFonts w:ascii="Calibri" w:hAnsi="Calibri"/>
                 <w:sz w:val="18"/>
               </w:rPr>
               <w:t>Seguridad adelantada</w:t>
@@ -1636,14 +1892,12 @@
       <w:tr>
         <w:tc>
           <w:tcPr>
-            <w:tcW w:type="dxa" w:w="1328"/>
-          </w:tcPr>
-          <w:p>
-            <w:r/>
-            <w:r>
-              <w:rPr>
-                <w:rFonts w:ascii="Calibri" w:hAnsi="Calibri"/>
-                <w:b w:val="0"/>
+            <w:tcW w:w="1328" w:type="dxa"/>
+          </w:tcPr>
+          <w:p>
+            <w:r>
+              <w:rPr>
+                <w:rFonts w:ascii="Calibri" w:hAnsi="Calibri"/>
                 <w:sz w:val="18"/>
               </w:rPr>
               <w:t>C4, C3</w:t>
@@ -1652,14 +1906,12 @@
         </w:tc>
         <w:tc>
           <w:tcPr>
-            <w:tcW w:type="dxa" w:w="1077"/>
-          </w:tcPr>
-          <w:p>
-            <w:r/>
-            <w:r>
-              <w:rPr>
-                <w:rFonts w:ascii="Calibri" w:hAnsi="Calibri"/>
-                <w:b w:val="0"/>
+            <w:tcW w:w="1077" w:type="dxa"/>
+          </w:tcPr>
+          <w:p>
+            <w:r>
+              <w:rPr>
+                <w:rFonts w:ascii="Calibri" w:hAnsi="Calibri"/>
                 <w:sz w:val="18"/>
               </w:rPr>
               <w:t>Sprint 1: usuarios y autenticación</w:t>
@@ -1668,46 +1920,81 @@
         </w:tc>
         <w:tc>
           <w:tcPr>
-            <w:tcW w:type="dxa" w:w="1276"/>
-          </w:tcPr>
-          <w:p>
-            <w:r/>
-            <w:r>
-              <w:rPr>
-                <w:rFonts w:ascii="Calibri" w:hAnsi="Calibri"/>
-                <w:b w:val="0"/>
-                <w:sz w:val="18"/>
-              </w:rPr>
-              <w:t>FastAPI, Flutter, PostgreSQL</w:t>
-            </w:r>
-          </w:p>
-        </w:tc>
-        <w:tc>
-          <w:tcPr>
-            <w:tcW w:type="dxa" w:w="1276"/>
-          </w:tcPr>
-          <w:p>
-            <w:r/>
-            <w:r>
-              <w:rPr>
-                <w:rFonts w:ascii="Calibri" w:hAnsi="Calibri"/>
-                <w:b w:val="0"/>
-                <w:sz w:val="18"/>
-              </w:rPr>
-              <w:t>3 sem.</w:t>
-            </w:r>
-          </w:p>
-        </w:tc>
-        <w:tc>
-          <w:tcPr>
-            <w:tcW w:type="dxa" w:w="1275"/>
-          </w:tcPr>
-          <w:p>
-            <w:r/>
-            <w:r>
-              <w:rPr>
-                <w:rFonts w:ascii="Calibri" w:hAnsi="Calibri"/>
-                <w:b w:val="0"/>
+            <w:tcW w:w="1276" w:type="dxa"/>
+          </w:tcPr>
+          <w:p>
+            <w:proofErr w:type="spellStart"/>
+            <w:r>
+              <w:rPr>
+                <w:rFonts w:ascii="Calibri" w:hAnsi="Calibri"/>
+                <w:sz w:val="18"/>
+              </w:rPr>
+              <w:t>FastAPI</w:t>
+            </w:r>
+            <w:proofErr w:type="spellEnd"/>
+            <w:r>
+              <w:rPr>
+                <w:rFonts w:ascii="Calibri" w:hAnsi="Calibri"/>
+                <w:sz w:val="18"/>
+              </w:rPr>
+              <w:t xml:space="preserve">, </w:t>
+            </w:r>
+            <w:proofErr w:type="spellStart"/>
+            <w:r>
+              <w:rPr>
+                <w:rFonts w:ascii="Calibri" w:hAnsi="Calibri"/>
+                <w:sz w:val="18"/>
+              </w:rPr>
+              <w:t>Flutter</w:t>
+            </w:r>
+            <w:proofErr w:type="spellEnd"/>
+            <w:r>
+              <w:rPr>
+                <w:rFonts w:ascii="Calibri" w:hAnsi="Calibri"/>
+                <w:sz w:val="18"/>
+              </w:rPr>
+              <w:t>, PostgreSQL</w:t>
+            </w:r>
+          </w:p>
+        </w:tc>
+        <w:tc>
+          <w:tcPr>
+            <w:tcW w:w="1276" w:type="dxa"/>
+          </w:tcPr>
+          <w:p>
+            <w:r>
+              <w:rPr>
+                <w:rFonts w:ascii="Calibri" w:hAnsi="Calibri"/>
+                <w:sz w:val="18"/>
+              </w:rPr>
+              <w:t xml:space="preserve">3 </w:t>
+            </w:r>
+            <w:proofErr w:type="spellStart"/>
+            <w:r>
+              <w:rPr>
+                <w:rFonts w:ascii="Calibri" w:hAnsi="Calibri"/>
+                <w:sz w:val="18"/>
+              </w:rPr>
+              <w:t>sem</w:t>
+            </w:r>
+            <w:proofErr w:type="spellEnd"/>
+            <w:r>
+              <w:rPr>
+                <w:rFonts w:ascii="Calibri" w:hAnsi="Calibri"/>
+                <w:sz w:val="18"/>
+              </w:rPr>
+              <w:t>.</w:t>
+            </w:r>
+          </w:p>
+        </w:tc>
+        <w:tc>
+          <w:tcPr>
+            <w:tcW w:w="1275" w:type="dxa"/>
+          </w:tcPr>
+          <w:p>
+            <w:r>
+              <w:rPr>
+                <w:rFonts w:ascii="Calibri" w:hAnsi="Calibri"/>
                 <w:sz w:val="18"/>
               </w:rPr>
               <w:t>Johan · Álvaro</w:t>
@@ -1716,14 +2003,12 @@
         </w:tc>
         <w:tc>
           <w:tcPr>
-            <w:tcW w:type="dxa" w:w="1276"/>
-          </w:tcPr>
-          <w:p>
-            <w:r/>
-            <w:r>
-              <w:rPr>
-                <w:rFonts w:ascii="Calibri" w:hAnsi="Calibri"/>
-                <w:b w:val="0"/>
+            <w:tcW w:w="1276" w:type="dxa"/>
+          </w:tcPr>
+          <w:p>
+            <w:r>
+              <w:rPr>
+                <w:rFonts w:ascii="Calibri" w:hAnsi="Calibri"/>
                 <w:sz w:val="18"/>
               </w:rPr>
               <w:t>Dificultad: riesgo de suplantación.</w:t>
@@ -1732,14 +2017,12 @@
         </w:tc>
         <w:tc>
           <w:tcPr>
-            <w:tcW w:type="dxa" w:w="1418"/>
-          </w:tcPr>
-          <w:p>
-            <w:r/>
-            <w:r>
-              <w:rPr>
-                <w:rFonts w:ascii="Calibri" w:hAnsi="Calibri"/>
-                <w:b w:val="0"/>
+            <w:tcW w:w="1418" w:type="dxa"/>
+          </w:tcPr>
+          <w:p>
+            <w:r>
+              <w:rPr>
+                <w:rFonts w:ascii="Calibri" w:hAnsi="Calibri"/>
                 <w:sz w:val="18"/>
               </w:rPr>
               <w:t>Completado</w:t>
@@ -1748,14 +2031,12 @@
         </w:tc>
         <w:tc>
           <w:tcPr>
-            <w:tcW w:type="dxa" w:w="850"/>
-          </w:tcPr>
-          <w:p>
-            <w:r/>
-            <w:r>
-              <w:rPr>
-                <w:rFonts w:ascii="Calibri" w:hAnsi="Calibri"/>
-                <w:b w:val="0"/>
+            <w:tcW w:w="850" w:type="dxa"/>
+          </w:tcPr>
+          <w:p>
+            <w:r>
+              <w:rPr>
+                <w:rFonts w:ascii="Calibri" w:hAnsi="Calibri"/>
                 <w:sz w:val="18"/>
               </w:rPr>
               <w:t>+1 semana</w:t>
@@ -1766,14 +2047,12 @@
       <w:tr>
         <w:tc>
           <w:tcPr>
-            <w:tcW w:type="dxa" w:w="1328"/>
-          </w:tcPr>
-          <w:p>
-            <w:r/>
-            <w:r>
-              <w:rPr>
-                <w:rFonts w:ascii="Calibri" w:hAnsi="Calibri"/>
-                <w:b w:val="0"/>
+            <w:tcW w:w="1328" w:type="dxa"/>
+          </w:tcPr>
+          <w:p>
+            <w:r>
+              <w:rPr>
+                <w:rFonts w:ascii="Calibri" w:hAnsi="Calibri"/>
                 <w:sz w:val="18"/>
               </w:rPr>
               <w:t>C4, C3</w:t>
@@ -1782,14 +2061,12 @@
         </w:tc>
         <w:tc>
           <w:tcPr>
-            <w:tcW w:type="dxa" w:w="1077"/>
-          </w:tcPr>
-          <w:p>
-            <w:r/>
-            <w:r>
-              <w:rPr>
-                <w:rFonts w:ascii="Calibri" w:hAnsi="Calibri"/>
-                <w:b w:val="0"/>
+            <w:tcW w:w="1077" w:type="dxa"/>
+          </w:tcPr>
+          <w:p>
+            <w:r>
+              <w:rPr>
+                <w:rFonts w:ascii="Calibri" w:hAnsi="Calibri"/>
                 <w:sz w:val="18"/>
               </w:rPr>
               <w:t>Sprint 2: spots y mapa</w:t>
@@ -1798,46 +2075,74 @@
         </w:tc>
         <w:tc>
           <w:tcPr>
-            <w:tcW w:type="dxa" w:w="1276"/>
-          </w:tcPr>
-          <w:p>
-            <w:r/>
-            <w:r>
-              <w:rPr>
-                <w:rFonts w:ascii="Calibri" w:hAnsi="Calibri"/>
-                <w:b w:val="0"/>
-                <w:sz w:val="18"/>
-              </w:rPr>
-              <w:t>Flutter, PostGIS</w:t>
-            </w:r>
-          </w:p>
-        </w:tc>
-        <w:tc>
-          <w:tcPr>
-            <w:tcW w:type="dxa" w:w="1276"/>
-          </w:tcPr>
-          <w:p>
-            <w:r/>
-            <w:r>
-              <w:rPr>
-                <w:rFonts w:ascii="Calibri" w:hAnsi="Calibri"/>
-                <w:b w:val="0"/>
-                <w:sz w:val="18"/>
-              </w:rPr>
-              <w:t>1 sem.</w:t>
-            </w:r>
-          </w:p>
-        </w:tc>
-        <w:tc>
-          <w:tcPr>
-            <w:tcW w:type="dxa" w:w="1275"/>
-          </w:tcPr>
-          <w:p>
-            <w:r/>
-            <w:r>
-              <w:rPr>
-                <w:rFonts w:ascii="Calibri" w:hAnsi="Calibri"/>
-                <w:b w:val="0"/>
+            <w:tcW w:w="1276" w:type="dxa"/>
+          </w:tcPr>
+          <w:p>
+            <w:proofErr w:type="spellStart"/>
+            <w:r>
+              <w:rPr>
+                <w:rFonts w:ascii="Calibri" w:hAnsi="Calibri"/>
+                <w:sz w:val="18"/>
+              </w:rPr>
+              <w:t>Flutter</w:t>
+            </w:r>
+            <w:proofErr w:type="spellEnd"/>
+            <w:r>
+              <w:rPr>
+                <w:rFonts w:ascii="Calibri" w:hAnsi="Calibri"/>
+                <w:sz w:val="18"/>
+              </w:rPr>
+              <w:t xml:space="preserve">, </w:t>
+            </w:r>
+            <w:proofErr w:type="spellStart"/>
+            <w:r>
+              <w:rPr>
+                <w:rFonts w:ascii="Calibri" w:hAnsi="Calibri"/>
+                <w:sz w:val="18"/>
+              </w:rPr>
+              <w:t>PostGIS</w:t>
+            </w:r>
+            <w:proofErr w:type="spellEnd"/>
+          </w:p>
+        </w:tc>
+        <w:tc>
+          <w:tcPr>
+            <w:tcW w:w="1276" w:type="dxa"/>
+          </w:tcPr>
+          <w:p>
+            <w:r>
+              <w:rPr>
+                <w:rFonts w:ascii="Calibri" w:hAnsi="Calibri"/>
+                <w:sz w:val="18"/>
+              </w:rPr>
+              <w:t xml:space="preserve">1 </w:t>
+            </w:r>
+            <w:proofErr w:type="spellStart"/>
+            <w:r>
+              <w:rPr>
+                <w:rFonts w:ascii="Calibri" w:hAnsi="Calibri"/>
+                <w:sz w:val="18"/>
+              </w:rPr>
+              <w:t>sem</w:t>
+            </w:r>
+            <w:proofErr w:type="spellEnd"/>
+            <w:r>
+              <w:rPr>
+                <w:rFonts w:ascii="Calibri" w:hAnsi="Calibri"/>
+                <w:sz w:val="18"/>
+              </w:rPr>
+              <w:t>.</w:t>
+            </w:r>
+          </w:p>
+        </w:tc>
+        <w:tc>
+          <w:tcPr>
+            <w:tcW w:w="1275" w:type="dxa"/>
+          </w:tcPr>
+          <w:p>
+            <w:r>
+              <w:rPr>
+                <w:rFonts w:ascii="Calibri" w:hAnsi="Calibri"/>
                 <w:sz w:val="18"/>
               </w:rPr>
               <w:t>Álvaro · Johan</w:t>
@@ -1846,14 +2151,12 @@
         </w:tc>
         <w:tc>
           <w:tcPr>
-            <w:tcW w:type="dxa" w:w="1276"/>
-          </w:tcPr>
-          <w:p>
-            <w:r/>
-            <w:r>
-              <w:rPr>
-                <w:rFonts w:ascii="Calibri" w:hAnsi="Calibri"/>
-                <w:b w:val="0"/>
+            <w:tcW w:w="1276" w:type="dxa"/>
+          </w:tcPr>
+          <w:p>
+            <w:r>
+              <w:rPr>
+                <w:rFonts w:ascii="Calibri" w:hAnsi="Calibri"/>
                 <w:sz w:val="18"/>
               </w:rPr>
               <w:t>Incluye índice espacial y cierre de HDU-04.</w:t>
@@ -1862,14 +2165,12 @@
         </w:tc>
         <w:tc>
           <w:tcPr>
-            <w:tcW w:type="dxa" w:w="1418"/>
-          </w:tcPr>
-          <w:p>
-            <w:r/>
-            <w:r>
-              <w:rPr>
-                <w:rFonts w:ascii="Calibri" w:hAnsi="Calibri"/>
-                <w:b w:val="0"/>
+            <w:tcW w:w="1418" w:type="dxa"/>
+          </w:tcPr>
+          <w:p>
+            <w:r>
+              <w:rPr>
+                <w:rFonts w:ascii="Calibri" w:hAnsi="Calibri"/>
                 <w:sz w:val="18"/>
               </w:rPr>
               <w:t>En curso</w:t>
@@ -1878,14 +2179,12 @@
         </w:tc>
         <w:tc>
           <w:tcPr>
-            <w:tcW w:type="dxa" w:w="850"/>
-          </w:tcPr>
-          <w:p>
-            <w:r/>
-            <w:r>
-              <w:rPr>
-                <w:rFonts w:ascii="Calibri" w:hAnsi="Calibri"/>
-                <w:b w:val="0"/>
+            <w:tcW w:w="850" w:type="dxa"/>
+          </w:tcPr>
+          <w:p>
+            <w:r>
+              <w:rPr>
+                <w:rFonts w:ascii="Calibri" w:hAnsi="Calibri"/>
                 <w:sz w:val="18"/>
               </w:rPr>
               <w:t>Desde 13-10</w:t>
@@ -1896,14 +2195,12 @@
       <w:tr>
         <w:tc>
           <w:tcPr>
-            <w:tcW w:type="dxa" w:w="1328"/>
-          </w:tcPr>
-          <w:p>
-            <w:r/>
-            <w:r>
-              <w:rPr>
-                <w:rFonts w:ascii="Calibri" w:hAnsi="Calibri"/>
-                <w:b w:val="0"/>
+            <w:tcW w:w="1328" w:type="dxa"/>
+          </w:tcPr>
+          <w:p>
+            <w:r>
+              <w:rPr>
+                <w:rFonts w:ascii="Calibri" w:hAnsi="Calibri"/>
                 <w:sz w:val="18"/>
               </w:rPr>
               <w:t>C4</w:t>
@@ -1912,14 +2209,12 @@
         </w:tc>
         <w:tc>
           <w:tcPr>
-            <w:tcW w:type="dxa" w:w="1077"/>
-          </w:tcPr>
-          <w:p>
-            <w:r/>
-            <w:r>
-              <w:rPr>
-                <w:rFonts w:ascii="Calibri" w:hAnsi="Calibri"/>
-                <w:b w:val="0"/>
+            <w:tcW w:w="1077" w:type="dxa"/>
+          </w:tcPr>
+          <w:p>
+            <w:r>
+              <w:rPr>
+                <w:rFonts w:ascii="Calibri" w:hAnsi="Calibri"/>
                 <w:sz w:val="18"/>
               </w:rPr>
               <w:t>Sprint 3: comunidad y mensajería</w:t>
@@ -1928,46 +2223,74 @@
         </w:tc>
         <w:tc>
           <w:tcPr>
-            <w:tcW w:type="dxa" w:w="1276"/>
-          </w:tcPr>
-          <w:p>
-            <w:r/>
-            <w:r>
-              <w:rPr>
-                <w:rFonts w:ascii="Calibri" w:hAnsi="Calibri"/>
-                <w:b w:val="0"/>
-                <w:sz w:val="18"/>
-              </w:rPr>
-              <w:t>FastAPI, Flutter</w:t>
-            </w:r>
-          </w:p>
-        </w:tc>
-        <w:tc>
-          <w:tcPr>
-            <w:tcW w:type="dxa" w:w="1276"/>
-          </w:tcPr>
-          <w:p>
-            <w:r/>
-            <w:r>
-              <w:rPr>
-                <w:rFonts w:ascii="Calibri" w:hAnsi="Calibri"/>
-                <w:b w:val="0"/>
-                <w:sz w:val="18"/>
-              </w:rPr>
-              <w:t>1 sem.</w:t>
-            </w:r>
-          </w:p>
-        </w:tc>
-        <w:tc>
-          <w:tcPr>
-            <w:tcW w:type="dxa" w:w="1275"/>
-          </w:tcPr>
-          <w:p>
-            <w:r/>
-            <w:r>
-              <w:rPr>
-                <w:rFonts w:ascii="Calibri" w:hAnsi="Calibri"/>
-                <w:b w:val="0"/>
+            <w:tcW w:w="1276" w:type="dxa"/>
+          </w:tcPr>
+          <w:p>
+            <w:proofErr w:type="spellStart"/>
+            <w:r>
+              <w:rPr>
+                <w:rFonts w:ascii="Calibri" w:hAnsi="Calibri"/>
+                <w:sz w:val="18"/>
+              </w:rPr>
+              <w:t>FastAPI</w:t>
+            </w:r>
+            <w:proofErr w:type="spellEnd"/>
+            <w:r>
+              <w:rPr>
+                <w:rFonts w:ascii="Calibri" w:hAnsi="Calibri"/>
+                <w:sz w:val="18"/>
+              </w:rPr>
+              <w:t xml:space="preserve">, </w:t>
+            </w:r>
+            <w:proofErr w:type="spellStart"/>
+            <w:r>
+              <w:rPr>
+                <w:rFonts w:ascii="Calibri" w:hAnsi="Calibri"/>
+                <w:sz w:val="18"/>
+              </w:rPr>
+              <w:t>Flutter</w:t>
+            </w:r>
+            <w:proofErr w:type="spellEnd"/>
+          </w:p>
+        </w:tc>
+        <w:tc>
+          <w:tcPr>
+            <w:tcW w:w="1276" w:type="dxa"/>
+          </w:tcPr>
+          <w:p>
+            <w:r>
+              <w:rPr>
+                <w:rFonts w:ascii="Calibri" w:hAnsi="Calibri"/>
+                <w:sz w:val="18"/>
+              </w:rPr>
+              <w:t xml:space="preserve">1 </w:t>
+            </w:r>
+            <w:proofErr w:type="spellStart"/>
+            <w:r>
+              <w:rPr>
+                <w:rFonts w:ascii="Calibri" w:hAnsi="Calibri"/>
+                <w:sz w:val="18"/>
+              </w:rPr>
+              <w:t>sem</w:t>
+            </w:r>
+            <w:proofErr w:type="spellEnd"/>
+            <w:r>
+              <w:rPr>
+                <w:rFonts w:ascii="Calibri" w:hAnsi="Calibri"/>
+                <w:sz w:val="18"/>
+              </w:rPr>
+              <w:t>.</w:t>
+            </w:r>
+          </w:p>
+        </w:tc>
+        <w:tc>
+          <w:tcPr>
+            <w:tcW w:w="1275" w:type="dxa"/>
+          </w:tcPr>
+          <w:p>
+            <w:r>
+              <w:rPr>
+                <w:rFonts w:ascii="Calibri" w:hAnsi="Calibri"/>
                 <w:sz w:val="18"/>
               </w:rPr>
               <w:t>Álvaro · Johan</w:t>
@@ -1976,14 +2299,12 @@
         </w:tc>
         <w:tc>
           <w:tcPr>
-            <w:tcW w:type="dxa" w:w="1276"/>
-          </w:tcPr>
-          <w:p>
-            <w:r/>
-            <w:r>
-              <w:rPr>
-                <w:rFonts w:ascii="Calibri" w:hAnsi="Calibri"/>
-                <w:b w:val="0"/>
+            <w:tcW w:w="1276" w:type="dxa"/>
+          </w:tcPr>
+          <w:p>
+            <w:r>
+              <w:rPr>
+                <w:rFonts w:ascii="Calibri" w:hAnsi="Calibri"/>
                 <w:sz w:val="18"/>
               </w:rPr>
               <w:t>Fusiona dos épicas.</w:t>
@@ -1992,14 +2313,12 @@
         </w:tc>
         <w:tc>
           <w:tcPr>
-            <w:tcW w:type="dxa" w:w="1418"/>
-          </w:tcPr>
-          <w:p>
-            <w:r/>
-            <w:r>
-              <w:rPr>
-                <w:rFonts w:ascii="Calibri" w:hAnsi="Calibri"/>
-                <w:b w:val="0"/>
+            <w:tcW w:w="1418" w:type="dxa"/>
+          </w:tcPr>
+          <w:p>
+            <w:r>
+              <w:rPr>
+                <w:rFonts w:ascii="Calibri" w:hAnsi="Calibri"/>
                 <w:sz w:val="18"/>
               </w:rPr>
               <w:t>No iniciado</w:t>
@@ -2008,14 +2327,12 @@
         </w:tc>
         <w:tc>
           <w:tcPr>
-            <w:tcW w:type="dxa" w:w="850"/>
-          </w:tcPr>
-          <w:p>
-            <w:r/>
-            <w:r>
-              <w:rPr>
-                <w:rFonts w:ascii="Calibri" w:hAnsi="Calibri"/>
-                <w:b w:val="0"/>
+            <w:tcW w:w="850" w:type="dxa"/>
+          </w:tcPr>
+          <w:p>
+            <w:r>
+              <w:rPr>
+                <w:rFonts w:ascii="Calibri" w:hAnsi="Calibri"/>
                 <w:sz w:val="18"/>
               </w:rPr>
               <w:t>Comprimido</w:t>
@@ -2026,14 +2343,12 @@
       <w:tr>
         <w:tc>
           <w:tcPr>
-            <w:tcW w:type="dxa" w:w="1328"/>
-          </w:tcPr>
-          <w:p>
-            <w:r/>
-            <w:r>
-              <w:rPr>
-                <w:rFonts w:ascii="Calibri" w:hAnsi="Calibri"/>
-                <w:b w:val="0"/>
+            <w:tcW w:w="1328" w:type="dxa"/>
+          </w:tcPr>
+          <w:p>
+            <w:r>
+              <w:rPr>
+                <w:rFonts w:ascii="Calibri" w:hAnsi="Calibri"/>
                 <w:sz w:val="18"/>
               </w:rPr>
               <w:t>C4</w:t>
@@ -2042,14 +2357,12 @@
         </w:tc>
         <w:tc>
           <w:tcPr>
-            <w:tcW w:type="dxa" w:w="1077"/>
-          </w:tcPr>
-          <w:p>
-            <w:r/>
-            <w:r>
-              <w:rPr>
-                <w:rFonts w:ascii="Calibri" w:hAnsi="Calibri"/>
-                <w:b w:val="0"/>
+            <w:tcW w:w="1077" w:type="dxa"/>
+          </w:tcPr>
+          <w:p>
+            <w:r>
+              <w:rPr>
+                <w:rFonts w:ascii="Calibri" w:hAnsi="Calibri"/>
                 <w:sz w:val="18"/>
               </w:rPr>
               <w:t>Sprint 4: gamificación y recompensas</w:t>
@@ -2058,46 +2371,74 @@
         </w:tc>
         <w:tc>
           <w:tcPr>
-            <w:tcW w:type="dxa" w:w="1276"/>
-          </w:tcPr>
-          <w:p>
-            <w:r/>
-            <w:r>
-              <w:rPr>
-                <w:rFonts w:ascii="Calibri" w:hAnsi="Calibri"/>
-                <w:b w:val="0"/>
-                <w:sz w:val="18"/>
-              </w:rPr>
-              <w:t>FastAPI, Flutter</w:t>
-            </w:r>
-          </w:p>
-        </w:tc>
-        <w:tc>
-          <w:tcPr>
-            <w:tcW w:type="dxa" w:w="1276"/>
-          </w:tcPr>
-          <w:p>
-            <w:r/>
-            <w:r>
-              <w:rPr>
-                <w:rFonts w:ascii="Calibri" w:hAnsi="Calibri"/>
-                <w:b w:val="0"/>
-                <w:sz w:val="18"/>
-              </w:rPr>
-              <w:t>1 sem.</w:t>
-            </w:r>
-          </w:p>
-        </w:tc>
-        <w:tc>
-          <w:tcPr>
-            <w:tcW w:type="dxa" w:w="1275"/>
-          </w:tcPr>
-          <w:p>
-            <w:r/>
-            <w:r>
-              <w:rPr>
-                <w:rFonts w:ascii="Calibri" w:hAnsi="Calibri"/>
-                <w:b w:val="0"/>
+            <w:tcW w:w="1276" w:type="dxa"/>
+          </w:tcPr>
+          <w:p>
+            <w:proofErr w:type="spellStart"/>
+            <w:r>
+              <w:rPr>
+                <w:rFonts w:ascii="Calibri" w:hAnsi="Calibri"/>
+                <w:sz w:val="18"/>
+              </w:rPr>
+              <w:t>FastAPI</w:t>
+            </w:r>
+            <w:proofErr w:type="spellEnd"/>
+            <w:r>
+              <w:rPr>
+                <w:rFonts w:ascii="Calibri" w:hAnsi="Calibri"/>
+                <w:sz w:val="18"/>
+              </w:rPr>
+              <w:t xml:space="preserve">, </w:t>
+            </w:r>
+            <w:proofErr w:type="spellStart"/>
+            <w:r>
+              <w:rPr>
+                <w:rFonts w:ascii="Calibri" w:hAnsi="Calibri"/>
+                <w:sz w:val="18"/>
+              </w:rPr>
+              <w:t>Flutter</w:t>
+            </w:r>
+            <w:proofErr w:type="spellEnd"/>
+          </w:p>
+        </w:tc>
+        <w:tc>
+          <w:tcPr>
+            <w:tcW w:w="1276" w:type="dxa"/>
+          </w:tcPr>
+          <w:p>
+            <w:r>
+              <w:rPr>
+                <w:rFonts w:ascii="Calibri" w:hAnsi="Calibri"/>
+                <w:sz w:val="18"/>
+              </w:rPr>
+              <w:t xml:space="preserve">1 </w:t>
+            </w:r>
+            <w:proofErr w:type="spellStart"/>
+            <w:r>
+              <w:rPr>
+                <w:rFonts w:ascii="Calibri" w:hAnsi="Calibri"/>
+                <w:sz w:val="18"/>
+              </w:rPr>
+              <w:t>sem</w:t>
+            </w:r>
+            <w:proofErr w:type="spellEnd"/>
+            <w:r>
+              <w:rPr>
+                <w:rFonts w:ascii="Calibri" w:hAnsi="Calibri"/>
+                <w:sz w:val="18"/>
+              </w:rPr>
+              <w:t>.</w:t>
+            </w:r>
+          </w:p>
+        </w:tc>
+        <w:tc>
+          <w:tcPr>
+            <w:tcW w:w="1275" w:type="dxa"/>
+          </w:tcPr>
+          <w:p>
+            <w:r>
+              <w:rPr>
+                <w:rFonts w:ascii="Calibri" w:hAnsi="Calibri"/>
                 <w:sz w:val="18"/>
               </w:rPr>
               <w:t>Johan · Álvaro</w:t>
@@ -2106,14 +2447,12 @@
         </w:tc>
         <w:tc>
           <w:tcPr>
-            <w:tcW w:type="dxa" w:w="1276"/>
-          </w:tcPr>
-          <w:p>
-            <w:r/>
-            <w:r>
-              <w:rPr>
-                <w:rFonts w:ascii="Calibri" w:hAnsi="Calibri"/>
-                <w:b w:val="0"/>
+            <w:tcW w:w="1276" w:type="dxa"/>
+          </w:tcPr>
+          <w:p>
+            <w:r>
+              <w:rPr>
+                <w:rFonts w:ascii="Calibri" w:hAnsi="Calibri"/>
                 <w:sz w:val="18"/>
               </w:rPr>
               <w:t>Reconstrucción del duelo S.K.A.T.E.</w:t>
@@ -2122,14 +2461,12 @@
         </w:tc>
         <w:tc>
           <w:tcPr>
-            <w:tcW w:type="dxa" w:w="1418"/>
-          </w:tcPr>
-          <w:p>
-            <w:r/>
-            <w:r>
-              <w:rPr>
-                <w:rFonts w:ascii="Calibri" w:hAnsi="Calibri"/>
-                <w:b w:val="0"/>
+            <w:tcW w:w="1418" w:type="dxa"/>
+          </w:tcPr>
+          <w:p>
+            <w:r>
+              <w:rPr>
+                <w:rFonts w:ascii="Calibri" w:hAnsi="Calibri"/>
                 <w:sz w:val="18"/>
               </w:rPr>
               <w:t>No iniciado</w:t>
@@ -2138,14 +2475,12 @@
         </w:tc>
         <w:tc>
           <w:tcPr>
-            <w:tcW w:type="dxa" w:w="850"/>
-          </w:tcPr>
-          <w:p>
-            <w:r/>
-            <w:r>
-              <w:rPr>
-                <w:rFonts w:ascii="Calibri" w:hAnsi="Calibri"/>
-                <w:b w:val="0"/>
+            <w:tcW w:w="850" w:type="dxa"/>
+          </w:tcPr>
+          <w:p>
+            <w:r>
+              <w:rPr>
+                <w:rFonts w:ascii="Calibri" w:hAnsi="Calibri"/>
                 <w:sz w:val="18"/>
               </w:rPr>
               <w:t>Comprimido</w:t>
@@ -2156,14 +2491,12 @@
       <w:tr>
         <w:tc>
           <w:tcPr>
-            <w:tcW w:type="dxa" w:w="1328"/>
-          </w:tcPr>
-          <w:p>
-            <w:r/>
-            <w:r>
-              <w:rPr>
-                <w:rFonts w:ascii="Calibri" w:hAnsi="Calibri"/>
-                <w:b w:val="0"/>
+            <w:tcW w:w="1328" w:type="dxa"/>
+          </w:tcPr>
+          <w:p>
+            <w:r>
+              <w:rPr>
+                <w:rFonts w:ascii="Calibri" w:hAnsi="Calibri"/>
                 <w:sz w:val="18"/>
               </w:rPr>
               <w:t>C1</w:t>
@@ -2172,14 +2505,12 @@
         </w:tc>
         <w:tc>
           <w:tcPr>
-            <w:tcW w:type="dxa" w:w="1077"/>
-          </w:tcPr>
-          <w:p>
-            <w:r/>
-            <w:r>
-              <w:rPr>
-                <w:rFonts w:ascii="Calibri" w:hAnsi="Calibri"/>
-                <w:b w:val="0"/>
+            <w:tcW w:w="1077" w:type="dxa"/>
+          </w:tcPr>
+          <w:p>
+            <w:r>
+              <w:rPr>
+                <w:rFonts w:ascii="Calibri" w:hAnsi="Calibri"/>
                 <w:sz w:val="18"/>
               </w:rPr>
               <w:t>Plan de pruebas y ejecución</w:t>
@@ -2188,30 +2519,35 @@
         </w:tc>
         <w:tc>
           <w:tcPr>
-            <w:tcW w:type="dxa" w:w="1276"/>
-          </w:tcPr>
-          <w:p>
-            <w:r/>
-            <w:r>
-              <w:rPr>
-                <w:rFonts w:ascii="Calibri" w:hAnsi="Calibri"/>
-                <w:b w:val="0"/>
-                <w:sz w:val="18"/>
-              </w:rPr>
-              <w:t>pytest, Docker</w:t>
-            </w:r>
-          </w:p>
-        </w:tc>
-        <w:tc>
-          <w:tcPr>
-            <w:tcW w:type="dxa" w:w="1276"/>
-          </w:tcPr>
-          <w:p>
-            <w:r/>
-            <w:r>
-              <w:rPr>
-                <w:rFonts w:ascii="Calibri" w:hAnsi="Calibri"/>
-                <w:b w:val="0"/>
+            <w:tcW w:w="1276" w:type="dxa"/>
+          </w:tcPr>
+          <w:p>
+            <w:proofErr w:type="spellStart"/>
+            <w:r>
+              <w:rPr>
+                <w:rFonts w:ascii="Calibri" w:hAnsi="Calibri"/>
+                <w:sz w:val="18"/>
+              </w:rPr>
+              <w:t>pytest</w:t>
+            </w:r>
+            <w:proofErr w:type="spellEnd"/>
+            <w:r>
+              <w:rPr>
+                <w:rFonts w:ascii="Calibri" w:hAnsi="Calibri"/>
+                <w:sz w:val="18"/>
+              </w:rPr>
+              <w:t>, Docker</w:t>
+            </w:r>
+          </w:p>
+        </w:tc>
+        <w:tc>
+          <w:tcPr>
+            <w:tcW w:w="1276" w:type="dxa"/>
+          </w:tcPr>
+          <w:p>
+            <w:r>
+              <w:rPr>
+                <w:rFonts w:ascii="Calibri" w:hAnsi="Calibri"/>
                 <w:sz w:val="18"/>
               </w:rPr>
               <w:t>Continuo</w:t>
@@ -2220,14 +2556,12 @@
         </w:tc>
         <w:tc>
           <w:tcPr>
-            <w:tcW w:type="dxa" w:w="1275"/>
-          </w:tcPr>
-          <w:p>
-            <w:r/>
-            <w:r>
-              <w:rPr>
-                <w:rFonts w:ascii="Calibri" w:hAnsi="Calibri"/>
-                <w:b w:val="0"/>
+            <w:tcW w:w="1275" w:type="dxa"/>
+          </w:tcPr>
+          <w:p>
+            <w:r>
+              <w:rPr>
+                <w:rFonts w:ascii="Calibri" w:hAnsi="Calibri"/>
                 <w:sz w:val="18"/>
               </w:rPr>
               <w:t>Johan · Álvaro</w:t>
@@ -2236,14 +2570,12 @@
         </w:tc>
         <w:tc>
           <w:tcPr>
-            <w:tcW w:type="dxa" w:w="1276"/>
-          </w:tcPr>
-          <w:p>
-            <w:r/>
-            <w:r>
-              <w:rPr>
-                <w:rFonts w:ascii="Calibri" w:hAnsi="Calibri"/>
-                <w:b w:val="0"/>
+            <w:tcW w:w="1276" w:type="dxa"/>
+          </w:tcPr>
+          <w:p>
+            <w:r>
+              <w:rPr>
+                <w:rFonts w:ascii="Calibri" w:hAnsi="Calibri"/>
                 <w:sz w:val="18"/>
               </w:rPr>
               <w:t>35 pruebas automatizadas.</w:t>
@@ -2252,14 +2584,12 @@
         </w:tc>
         <w:tc>
           <w:tcPr>
-            <w:tcW w:type="dxa" w:w="1418"/>
-          </w:tcPr>
-          <w:p>
-            <w:r/>
-            <w:r>
-              <w:rPr>
-                <w:rFonts w:ascii="Calibri" w:hAnsi="Calibri"/>
-                <w:b w:val="0"/>
+            <w:tcW w:w="1418" w:type="dxa"/>
+          </w:tcPr>
+          <w:p>
+            <w:r>
+              <w:rPr>
+                <w:rFonts w:ascii="Calibri" w:hAnsi="Calibri"/>
                 <w:sz w:val="18"/>
               </w:rPr>
               <w:t>En curso</w:t>
@@ -2268,14 +2598,12 @@
         </w:tc>
         <w:tc>
           <w:tcPr>
-            <w:tcW w:type="dxa" w:w="850"/>
-          </w:tcPr>
-          <w:p>
-            <w:r/>
-            <w:r>
-              <w:rPr>
-                <w:rFonts w:ascii="Calibri" w:hAnsi="Calibri"/>
-                <w:b w:val="0"/>
+            <w:tcW w:w="850" w:type="dxa"/>
+          </w:tcPr>
+          <w:p>
+            <w:r>
+              <w:rPr>
+                <w:rFonts w:ascii="Calibri" w:hAnsi="Calibri"/>
                 <w:sz w:val="18"/>
               </w:rPr>
               <w:t>Por sprint</w:t>
@@ -2286,30 +2614,27 @@
       <w:tr>
         <w:tc>
           <w:tcPr>
-            <w:tcW w:type="dxa" w:w="1328"/>
-          </w:tcPr>
-          <w:p>
-            <w:r/>
-            <w:r>
-              <w:rPr>
-                <w:rFonts w:ascii="Calibri" w:hAnsi="Calibri"/>
-                <w:b w:val="0"/>
-                <w:sz w:val="18"/>
-              </w:rPr>
+            <w:tcW w:w="1328" w:type="dxa"/>
+          </w:tcPr>
+          <w:p>
+            <w:r>
+              <w:rPr>
+                <w:rFonts w:ascii="Calibri" w:hAnsi="Calibri"/>
+                <w:sz w:val="18"/>
+              </w:rPr>
+              <w:lastRenderedPageBreak/>
               <w:t>Seguridad</w:t>
             </w:r>
           </w:p>
         </w:tc>
         <w:tc>
           <w:tcPr>
-            <w:tcW w:type="dxa" w:w="1077"/>
-          </w:tcPr>
-          <w:p>
-            <w:r/>
-            <w:r>
-              <w:rPr>
-                <w:rFonts w:ascii="Calibri" w:hAnsi="Calibri"/>
-                <w:b w:val="0"/>
+            <w:tcW w:w="1077" w:type="dxa"/>
+          </w:tcPr>
+          <w:p>
+            <w:r>
+              <w:rPr>
+                <w:rFonts w:ascii="Calibri" w:hAnsi="Calibri"/>
                 <w:sz w:val="18"/>
               </w:rPr>
               <w:t>Plan de seguridad y auditoría</w:t>
@@ -2318,14 +2643,12 @@
         </w:tc>
         <w:tc>
           <w:tcPr>
-            <w:tcW w:type="dxa" w:w="1276"/>
-          </w:tcPr>
-          <w:p>
-            <w:r/>
-            <w:r>
-              <w:rPr>
-                <w:rFonts w:ascii="Calibri" w:hAnsi="Calibri"/>
-                <w:b w:val="0"/>
+            <w:tcW w:w="1276" w:type="dxa"/>
+          </w:tcPr>
+          <w:p>
+            <w:r>
+              <w:rPr>
+                <w:rFonts w:ascii="Calibri" w:hAnsi="Calibri"/>
                 <w:sz w:val="18"/>
               </w:rPr>
               <w:t>OWASP API Top 10</w:t>
@@ -2334,30 +2657,42 @@
         </w:tc>
         <w:tc>
           <w:tcPr>
-            <w:tcW w:type="dxa" w:w="1276"/>
-          </w:tcPr>
-          <w:p>
-            <w:r/>
-            <w:r>
-              <w:rPr>
-                <w:rFonts w:ascii="Calibri" w:hAnsi="Calibri"/>
-                <w:b w:val="0"/>
-                <w:sz w:val="18"/>
-              </w:rPr>
-              <w:t>1 sem.</w:t>
-            </w:r>
-          </w:p>
-        </w:tc>
-        <w:tc>
-          <w:tcPr>
-            <w:tcW w:type="dxa" w:w="1275"/>
-          </w:tcPr>
-          <w:p>
-            <w:r/>
-            <w:r>
-              <w:rPr>
-                <w:rFonts w:ascii="Calibri" w:hAnsi="Calibri"/>
-                <w:b w:val="0"/>
+            <w:tcW w:w="1276" w:type="dxa"/>
+          </w:tcPr>
+          <w:p>
+            <w:r>
+              <w:rPr>
+                <w:rFonts w:ascii="Calibri" w:hAnsi="Calibri"/>
+                <w:sz w:val="18"/>
+              </w:rPr>
+              <w:t xml:space="preserve">1 </w:t>
+            </w:r>
+            <w:proofErr w:type="spellStart"/>
+            <w:r>
+              <w:rPr>
+                <w:rFonts w:ascii="Calibri" w:hAnsi="Calibri"/>
+                <w:sz w:val="18"/>
+              </w:rPr>
+              <w:t>sem</w:t>
+            </w:r>
+            <w:proofErr w:type="spellEnd"/>
+            <w:r>
+              <w:rPr>
+                <w:rFonts w:ascii="Calibri" w:hAnsi="Calibri"/>
+                <w:sz w:val="18"/>
+              </w:rPr>
+              <w:t>.</w:t>
+            </w:r>
+          </w:p>
+        </w:tc>
+        <w:tc>
+          <w:tcPr>
+            <w:tcW w:w="1275" w:type="dxa"/>
+          </w:tcPr>
+          <w:p>
+            <w:r>
+              <w:rPr>
+                <w:rFonts w:ascii="Calibri" w:hAnsi="Calibri"/>
                 <w:sz w:val="18"/>
               </w:rPr>
               <w:t>Johan</w:t>
@@ -2366,14 +2701,12 @@
         </w:tc>
         <w:tc>
           <w:tcPr>
-            <w:tcW w:type="dxa" w:w="1276"/>
-          </w:tcPr>
-          <w:p>
-            <w:r/>
-            <w:r>
-              <w:rPr>
-                <w:rFonts w:ascii="Calibri" w:hAnsi="Calibri"/>
-                <w:b w:val="0"/>
+            <w:tcW w:w="1276" w:type="dxa"/>
+          </w:tcPr>
+          <w:p>
+            <w:r>
+              <w:rPr>
+                <w:rFonts w:ascii="Calibri" w:hAnsi="Calibri"/>
                 <w:sz w:val="18"/>
               </w:rPr>
               <w:t>Remediación ya ejecutada.</w:t>
@@ -2382,14 +2715,12 @@
         </w:tc>
         <w:tc>
           <w:tcPr>
-            <w:tcW w:type="dxa" w:w="1418"/>
-          </w:tcPr>
-          <w:p>
-            <w:r/>
-            <w:r>
-              <w:rPr>
-                <w:rFonts w:ascii="Calibri" w:hAnsi="Calibri"/>
-                <w:b w:val="0"/>
+            <w:tcW w:w="1418" w:type="dxa"/>
+          </w:tcPr>
+          <w:p>
+            <w:r>
+              <w:rPr>
+                <w:rFonts w:ascii="Calibri" w:hAnsi="Calibri"/>
                 <w:sz w:val="18"/>
               </w:rPr>
               <w:t>Ajustada</w:t>
@@ -2398,14 +2729,12 @@
         </w:tc>
         <w:tc>
           <w:tcPr>
-            <w:tcW w:type="dxa" w:w="850"/>
-          </w:tcPr>
-          <w:p>
-            <w:r/>
-            <w:r>
-              <w:rPr>
-                <w:rFonts w:ascii="Calibri" w:hAnsi="Calibri"/>
-                <w:b w:val="0"/>
+            <w:tcW w:w="850" w:type="dxa"/>
+          </w:tcPr>
+          <w:p>
+            <w:r>
+              <w:rPr>
+                <w:rFonts w:ascii="Calibri" w:hAnsi="Calibri"/>
                 <w:sz w:val="18"/>
               </w:rPr>
               <w:t>Doc. al final</w:t>
@@ -2416,14 +2745,12 @@
       <w:tr>
         <w:tc>
           <w:tcPr>
-            <w:tcW w:type="dxa" w:w="1328"/>
-          </w:tcPr>
-          <w:p>
-            <w:r/>
-            <w:r>
-              <w:rPr>
-                <w:rFonts w:ascii="Calibri" w:hAnsi="Calibri"/>
-                <w:b w:val="0"/>
+            <w:tcW w:w="1328" w:type="dxa"/>
+          </w:tcPr>
+          <w:p>
+            <w:r>
+              <w:rPr>
+                <w:rFonts w:ascii="Calibri" w:hAnsi="Calibri"/>
                 <w:sz w:val="18"/>
               </w:rPr>
               <w:t>Emprendimiento</w:t>
@@ -2432,14 +2759,12 @@
         </w:tc>
         <w:tc>
           <w:tcPr>
-            <w:tcW w:type="dxa" w:w="1077"/>
-          </w:tcPr>
-          <w:p>
-            <w:r/>
-            <w:r>
-              <w:rPr>
-                <w:rFonts w:ascii="Calibri" w:hAnsi="Calibri"/>
-                <w:b w:val="0"/>
+            <w:tcW w:w="1077" w:type="dxa"/>
+          </w:tcPr>
+          <w:p>
+            <w:r>
+              <w:rPr>
+                <w:rFonts w:ascii="Calibri" w:hAnsi="Calibri"/>
                 <w:sz w:val="18"/>
               </w:rPr>
               <w:t>Evaluación económica (VAN, TIR, ROI)</w:t>
@@ -2448,14 +2773,12 @@
         </w:tc>
         <w:tc>
           <w:tcPr>
-            <w:tcW w:type="dxa" w:w="1276"/>
-          </w:tcPr>
-          <w:p>
-            <w:r/>
-            <w:r>
-              <w:rPr>
-                <w:rFonts w:ascii="Calibri" w:hAnsi="Calibri"/>
-                <w:b w:val="0"/>
+            <w:tcW w:w="1276" w:type="dxa"/>
+          </w:tcPr>
+          <w:p>
+            <w:r>
+              <w:rPr>
+                <w:rFonts w:ascii="Calibri" w:hAnsi="Calibri"/>
                 <w:sz w:val="18"/>
               </w:rPr>
               <w:t>Planilla de cálculo</w:t>
@@ -2464,30 +2787,42 @@
         </w:tc>
         <w:tc>
           <w:tcPr>
-            <w:tcW w:type="dxa" w:w="1276"/>
-          </w:tcPr>
-          <w:p>
-            <w:r/>
-            <w:r>
-              <w:rPr>
-                <w:rFonts w:ascii="Calibri" w:hAnsi="Calibri"/>
-                <w:b w:val="0"/>
-                <w:sz w:val="18"/>
-              </w:rPr>
-              <w:t>1 sem.</w:t>
-            </w:r>
-          </w:p>
-        </w:tc>
-        <w:tc>
-          <w:tcPr>
-            <w:tcW w:type="dxa" w:w="1275"/>
-          </w:tcPr>
-          <w:p>
-            <w:r/>
-            <w:r>
-              <w:rPr>
-                <w:rFonts w:ascii="Calibri" w:hAnsi="Calibri"/>
-                <w:b w:val="0"/>
+            <w:tcW w:w="1276" w:type="dxa"/>
+          </w:tcPr>
+          <w:p>
+            <w:r>
+              <w:rPr>
+                <w:rFonts w:ascii="Calibri" w:hAnsi="Calibri"/>
+                <w:sz w:val="18"/>
+              </w:rPr>
+              <w:t xml:space="preserve">1 </w:t>
+            </w:r>
+            <w:proofErr w:type="spellStart"/>
+            <w:r>
+              <w:rPr>
+                <w:rFonts w:ascii="Calibri" w:hAnsi="Calibri"/>
+                <w:sz w:val="18"/>
+              </w:rPr>
+              <w:t>sem</w:t>
+            </w:r>
+            <w:proofErr w:type="spellEnd"/>
+            <w:r>
+              <w:rPr>
+                <w:rFonts w:ascii="Calibri" w:hAnsi="Calibri"/>
+                <w:sz w:val="18"/>
+              </w:rPr>
+              <w:t>.</w:t>
+            </w:r>
+          </w:p>
+        </w:tc>
+        <w:tc>
+          <w:tcPr>
+            <w:tcW w:w="1275" w:type="dxa"/>
+          </w:tcPr>
+          <w:p>
+            <w:r>
+              <w:rPr>
+                <w:rFonts w:ascii="Calibri" w:hAnsi="Calibri"/>
                 <w:sz w:val="18"/>
               </w:rPr>
               <w:t>Álvaro</w:t>
@@ -2496,14 +2831,12 @@
         </w:tc>
         <w:tc>
           <w:tcPr>
-            <w:tcW w:type="dxa" w:w="1276"/>
-          </w:tcPr>
-          <w:p>
-            <w:r/>
-            <w:r>
-              <w:rPr>
-                <w:rFonts w:ascii="Calibri" w:hAnsi="Calibri"/>
-                <w:b w:val="0"/>
+            <w:tcW w:w="1276" w:type="dxa"/>
+          </w:tcPr>
+          <w:p>
+            <w:r>
+              <w:rPr>
+                <w:rFonts w:ascii="Calibri" w:hAnsi="Calibri"/>
                 <w:sz w:val="18"/>
               </w:rPr>
               <w:t>Comprometida en la Fase 1.</w:t>
@@ -2512,14 +2845,12 @@
         </w:tc>
         <w:tc>
           <w:tcPr>
-            <w:tcW w:type="dxa" w:w="1418"/>
-          </w:tcPr>
-          <w:p>
-            <w:r/>
-            <w:r>
-              <w:rPr>
-                <w:rFonts w:ascii="Calibri" w:hAnsi="Calibri"/>
-                <w:b w:val="0"/>
+            <w:tcW w:w="1418" w:type="dxa"/>
+          </w:tcPr>
+          <w:p>
+            <w:r>
+              <w:rPr>
+                <w:rFonts w:ascii="Calibri" w:hAnsi="Calibri"/>
                 <w:sz w:val="18"/>
               </w:rPr>
               <w:t>No iniciado</w:t>
@@ -2528,14 +2859,12 @@
         </w:tc>
         <w:tc>
           <w:tcPr>
-            <w:tcW w:type="dxa" w:w="850"/>
-          </w:tcPr>
-          <w:p>
-            <w:r/>
-            <w:r>
-              <w:rPr>
-                <w:rFonts w:ascii="Calibri" w:hAnsi="Calibri"/>
-                <w:b w:val="0"/>
+            <w:tcW w:w="850" w:type="dxa"/>
+          </w:tcPr>
+          <w:p>
+            <w:r>
+              <w:rPr>
+                <w:rFonts w:ascii="Calibri" w:hAnsi="Calibri"/>
                 <w:sz w:val="18"/>
               </w:rPr>
               <w:t>Sprint 5</w:t>
@@ -2546,14 +2875,12 @@
       <w:tr>
         <w:tc>
           <w:tcPr>
-            <w:tcW w:type="dxa" w:w="1328"/>
-          </w:tcPr>
-          <w:p>
-            <w:r/>
-            <w:r>
-              <w:rPr>
-                <w:rFonts w:ascii="Calibri" w:hAnsi="Calibri"/>
-                <w:b w:val="0"/>
+            <w:tcW w:w="1328" w:type="dxa"/>
+          </w:tcPr>
+          <w:p>
+            <w:r>
+              <w:rPr>
+                <w:rFonts w:ascii="Calibri" w:hAnsi="Calibri"/>
                 <w:sz w:val="18"/>
               </w:rPr>
               <w:t>C2</w:t>
@@ -2562,14 +2889,12 @@
         </w:tc>
         <w:tc>
           <w:tcPr>
-            <w:tcW w:type="dxa" w:w="1077"/>
-          </w:tcPr>
-          <w:p>
-            <w:r/>
-            <w:r>
-              <w:rPr>
-                <w:rFonts w:ascii="Calibri" w:hAnsi="Calibri"/>
-                <w:b w:val="0"/>
+            <w:tcW w:w="1077" w:type="dxa"/>
+          </w:tcPr>
+          <w:p>
+            <w:r>
+              <w:rPr>
+                <w:rFonts w:ascii="Calibri" w:hAnsi="Calibri"/>
                 <w:sz w:val="18"/>
               </w:rPr>
               <w:t>Documentación, evidencias e informe final</w:t>
@@ -2578,14 +2903,12 @@
         </w:tc>
         <w:tc>
           <w:tcPr>
-            <w:tcW w:type="dxa" w:w="1276"/>
-          </w:tcPr>
-          <w:p>
-            <w:r/>
-            <w:r>
-              <w:rPr>
-                <w:rFonts w:ascii="Calibri" w:hAnsi="Calibri"/>
-                <w:b w:val="0"/>
+            <w:tcW w:w="1276" w:type="dxa"/>
+          </w:tcPr>
+          <w:p>
+            <w:r>
+              <w:rPr>
+                <w:rFonts w:ascii="Calibri" w:hAnsi="Calibri"/>
                 <w:sz w:val="18"/>
               </w:rPr>
               <w:t>GitHub, Jira, Word</w:t>
@@ -2594,14 +2917,12 @@
         </w:tc>
         <w:tc>
           <w:tcPr>
-            <w:tcW w:type="dxa" w:w="1276"/>
-          </w:tcPr>
-          <w:p>
-            <w:r/>
-            <w:r>
-              <w:rPr>
-                <w:rFonts w:ascii="Calibri" w:hAnsi="Calibri"/>
-                <w:b w:val="0"/>
+            <w:tcW w:w="1276" w:type="dxa"/>
+          </w:tcPr>
+          <w:p>
+            <w:r>
+              <w:rPr>
+                <w:rFonts w:ascii="Calibri" w:hAnsi="Calibri"/>
                 <w:sz w:val="18"/>
               </w:rPr>
               <w:t>Continuo</w:t>
@@ -2610,14 +2931,12 @@
         </w:tc>
         <w:tc>
           <w:tcPr>
-            <w:tcW w:type="dxa" w:w="1275"/>
-          </w:tcPr>
-          <w:p>
-            <w:r/>
-            <w:r>
-              <w:rPr>
-                <w:rFonts w:ascii="Calibri" w:hAnsi="Calibri"/>
-                <w:b w:val="0"/>
+            <w:tcW w:w="1275" w:type="dxa"/>
+          </w:tcPr>
+          <w:p>
+            <w:r>
+              <w:rPr>
+                <w:rFonts w:ascii="Calibri" w:hAnsi="Calibri"/>
                 <w:sz w:val="18"/>
               </w:rPr>
               <w:t>Johan · Álvaro</w:t>
@@ -2626,14 +2945,12 @@
         </w:tc>
         <w:tc>
           <w:tcPr>
-            <w:tcW w:type="dxa" w:w="1276"/>
-          </w:tcPr>
-          <w:p>
-            <w:r/>
-            <w:r>
-              <w:rPr>
-                <w:rFonts w:ascii="Calibri" w:hAnsi="Calibri"/>
-                <w:b w:val="0"/>
+            <w:tcW w:w="1276" w:type="dxa"/>
+          </w:tcPr>
+          <w:p>
+            <w:r>
+              <w:rPr>
+                <w:rFonts w:ascii="Calibri" w:hAnsi="Calibri"/>
                 <w:sz w:val="18"/>
               </w:rPr>
               <w:t>Repositorio público como centro de evidencias.</w:t>
@@ -2642,14 +2959,12 @@
         </w:tc>
         <w:tc>
           <w:tcPr>
-            <w:tcW w:type="dxa" w:w="1418"/>
-          </w:tcPr>
-          <w:p>
-            <w:r/>
-            <w:r>
-              <w:rPr>
-                <w:rFonts w:ascii="Calibri" w:hAnsi="Calibri"/>
-                <w:b w:val="0"/>
+            <w:tcW w:w="1418" w:type="dxa"/>
+          </w:tcPr>
+          <w:p>
+            <w:r>
+              <w:rPr>
+                <w:rFonts w:ascii="Calibri" w:hAnsi="Calibri"/>
                 <w:sz w:val="18"/>
               </w:rPr>
               <w:t>En curso</w:t>
@@ -2658,14 +2973,12 @@
         </w:tc>
         <w:tc>
           <w:tcPr>
-            <w:tcW w:type="dxa" w:w="850"/>
-          </w:tcPr>
-          <w:p>
-            <w:r/>
-            <w:r>
-              <w:rPr>
-                <w:rFonts w:ascii="Calibri" w:hAnsi="Calibri"/>
-                <w:b w:val="0"/>
+            <w:tcW w:w="850" w:type="dxa"/>
+          </w:tcPr>
+          <w:p>
+            <w:r>
+              <w:rPr>
+                <w:rFonts w:ascii="Calibri" w:hAnsi="Calibri"/>
                 <w:sz w:val="18"/>
               </w:rPr>
               <w:t>Entrega 06-11</w:t>
@@ -2751,84 +3064,6 @@
           </w:p>
         </w:tc>
       </w:tr>
-      <w:tr>
-        <w:trPr>
-          <w:trHeight w:val="800"/>
-        </w:trPr>
-        <w:tc>
-          <w:tcPr>
-            <w:tcW w:w="9498" w:type="dxa"/>
-            <w:shd w:val="clear" w:color="auto" w:fill="D9E2F3" w:themeFill="accent1" w:themeFillTint="33"/>
-            <w:vAlign w:val="center"/>
-          </w:tcPr>
-          <w:p>
-            <w:pPr>
-              <w:pStyle w:val="Piedepgina"/>
-              <w:jc w:val="both"/>
-              <w:rPr>
-                <w:rFonts w:ascii="Calibri" w:hAnsi="Calibri"/>
-                <w:color w:val="1F3864" w:themeColor="accent1" w:themeShade="80"/>
-              </w:rPr>
-            </w:pPr>
-            <w:r>
-              <w:rPr>
-                <w:rFonts w:ascii="Calibri" w:hAnsi="Calibri"/>
-                <w:color w:val="1F3864" w:themeColor="accent1" w:themeShade="80"/>
-              </w:rPr>
-              <w:t>Profundiza en las observaciones de tu plan de trabajo</w:t>
-            </w:r>
-            <w:r>
-              <w:rPr>
-                <w:rFonts w:ascii="Calibri" w:hAnsi="Calibri"/>
-                <w:color w:val="1F3864" w:themeColor="accent1" w:themeShade="80"/>
-              </w:rPr>
-              <w:t xml:space="preserve">. Analiza las actividades planificadas y señala </w:t>
-            </w:r>
-            <w:r>
-              <w:rPr>
-                <w:rFonts w:ascii="Calibri" w:hAnsi="Calibri"/>
-                <w:color w:val="1F3864" w:themeColor="accent1" w:themeShade="80"/>
-              </w:rPr>
-              <w:t xml:space="preserve">qué </w:t>
-            </w:r>
-            <w:r>
-              <w:rPr>
-                <w:rFonts w:ascii="Calibri" w:hAnsi="Calibri"/>
-                <w:color w:val="1F3864" w:themeColor="accent1" w:themeShade="80"/>
-              </w:rPr>
-              <w:t xml:space="preserve">aspectos facilitaron u </w:t>
-            </w:r>
-            <w:r>
-              <w:rPr>
-                <w:rFonts w:ascii="Calibri" w:hAnsi="Calibri"/>
-                <w:color w:val="1F3864" w:themeColor="accent1" w:themeShade="80"/>
-              </w:rPr>
-              <w:t>obst</w:t>
-            </w:r>
-            <w:r>
-              <w:rPr>
-                <w:rFonts w:ascii="Calibri" w:hAnsi="Calibri"/>
-                <w:color w:val="1F3864" w:themeColor="accent1" w:themeShade="80"/>
-              </w:rPr>
-              <w:t xml:space="preserve">aculizaron la ejecución del plan. Plantea </w:t>
-            </w:r>
-            <w:r>
-              <w:rPr>
-                <w:rFonts w:ascii="Calibri" w:hAnsi="Calibri"/>
-                <w:color w:val="1F3864" w:themeColor="accent1" w:themeShade="80"/>
-              </w:rPr>
-              <w:t>cómo abordaste y/o abordarás</w:t>
-            </w:r>
-            <w:r>
-              <w:rPr>
-                <w:rFonts w:ascii="Calibri" w:hAnsi="Calibri"/>
-                <w:color w:val="1F3864" w:themeColor="accent1" w:themeShade="80"/>
-              </w:rPr>
-              <w:t xml:space="preserve"> los obstáculos. Por último, señala los ajustes que realizaste al plan de trabajo a partir de este análisis.</w:t>
-            </w:r>
-          </w:p>
-        </w:tc>
-      </w:tr>
     </w:tbl>
     <w:p>
       <w:pPr>
@@ -2869,12 +3104,10 @@
             <w:vAlign w:val="center"/>
           </w:tcPr>
           <w:p>
-            <w:r/>
             <w:r>
               <w:rPr>
                 <w:rFonts w:ascii="Calibri" w:hAnsi="Calibri"/>
                 <w:b/>
-                <w:sz w:val="22"/>
               </w:rPr>
               <w:t>Factores que han facilitado y/o dificultado el desarrollo de mi plan de trabajo:</w:t>
             </w:r>
@@ -2886,10 +3119,22 @@
             <w:r>
               <w:rPr>
                 <w:rFonts w:ascii="Calibri" w:hAnsi="Calibri"/>
-                <w:b w:val="0"/>
-                <w:sz w:val="22"/>
-              </w:rPr>
-              <w:t>Facilitadores: versión piloto publicada que permite validar con usuarios de prueba; dominio del stack; documentación base lista desde el Sprint 0; entorno Docker para probar sin tocar datos reales.</w:t>
+              </w:rPr>
+              <w:t xml:space="preserve">Facilitadores: versión piloto publicada que permite validar con usuarios de prueba; dominio del </w:t>
+            </w:r>
+            <w:proofErr w:type="spellStart"/>
+            <w:r>
+              <w:rPr>
+                <w:rFonts w:ascii="Calibri" w:hAnsi="Calibri"/>
+              </w:rPr>
+              <w:t>stack</w:t>
+            </w:r>
+            <w:proofErr w:type="spellEnd"/>
+            <w:r>
+              <w:rPr>
+                <w:rFonts w:ascii="Calibri" w:hAnsi="Calibri"/>
+              </w:rPr>
+              <w:t>; documentación base lista desde el Sprint 0; entorno Docker para probar sin tocar datos reales.</w:t>
             </w:r>
           </w:p>
           <w:p>
@@ -2899,10 +3144,50 @@
             <w:r>
               <w:rPr>
                 <w:rFonts w:ascii="Calibri" w:hAnsi="Calibri"/>
-                <w:b w:val="0"/>
-                <w:sz w:val="22"/>
-              </w:rPr>
-              <w:t>Dificultades y acciones: (1) riesgo de suplantación de identidad en endpoints que confiaban en el id del cliente → adelantamos la seguridad base y la cubrimos con pruebas negativas; (2) poco tiempo disponible por trabajo y estudios → priorización MoSCoW y sprints cortos; (3) pausa automática de la base de datos en Supabase el 12-10 → reanudación el mismo día y corrección para evitar nuevas pausas; (4) rechazo de la versión 1.0.2 en Google Play por alineación de librerías a 16 KB → corregido en el código, publicación pendiente.</w:t>
+              </w:rPr>
+              <w:t xml:space="preserve">Dificultades y acciones: (1) riesgo de suplantación de identidad en </w:t>
+            </w:r>
+            <w:proofErr w:type="spellStart"/>
+            <w:r>
+              <w:rPr>
+                <w:rFonts w:ascii="Calibri" w:hAnsi="Calibri"/>
+              </w:rPr>
+              <w:t>endpoints</w:t>
+            </w:r>
+            <w:proofErr w:type="spellEnd"/>
+            <w:r>
+              <w:rPr>
+                <w:rFonts w:ascii="Calibri" w:hAnsi="Calibri"/>
+              </w:rPr>
+              <w:t xml:space="preserve"> que confiaban en el id del cliente → adelantamos la seguridad base y la cubrimos con pruebas negativas; (2) poco tiempo disponible por trabajo y estudios → priorización MoSCoW y </w:t>
+            </w:r>
+            <w:proofErr w:type="spellStart"/>
+            <w:r>
+              <w:rPr>
+                <w:rFonts w:ascii="Calibri" w:hAnsi="Calibri"/>
+              </w:rPr>
+              <w:t>sprints</w:t>
+            </w:r>
+            <w:proofErr w:type="spellEnd"/>
+            <w:r>
+              <w:rPr>
+                <w:rFonts w:ascii="Calibri" w:hAnsi="Calibri"/>
+              </w:rPr>
+              <w:t xml:space="preserve"> cortos; (3) pausa automática de la base de datos en </w:t>
+            </w:r>
+            <w:proofErr w:type="spellStart"/>
+            <w:r>
+              <w:rPr>
+                <w:rFonts w:ascii="Calibri" w:hAnsi="Calibri"/>
+              </w:rPr>
+              <w:t>Supabase</w:t>
+            </w:r>
+            <w:proofErr w:type="spellEnd"/>
+            <w:r>
+              <w:rPr>
+                <w:rFonts w:ascii="Calibri" w:hAnsi="Calibri"/>
+              </w:rPr>
+              <w:t xml:space="preserve"> el 12-10 → reanudación el mismo día y corrección para evitar nuevas pausas; (4) rechazo de la versión 1.0.2 en Google Play por alineación de librerías a 16 KB → corregido en el código, publicación pendiente.</w:t>
             </w:r>
           </w:p>
         </w:tc>
@@ -2947,12 +3232,10 @@
             <w:vAlign w:val="center"/>
           </w:tcPr>
           <w:p>
-            <w:r/>
             <w:r>
               <w:rPr>
                 <w:rFonts w:ascii="Calibri" w:hAnsi="Calibri"/>
                 <w:b/>
-                <w:sz w:val="22"/>
               </w:rPr>
               <w:t>Actividades ajustadas o eliminadas:</w:t>
             </w:r>
@@ -2964,10 +3247,36 @@
             <w:r>
               <w:rPr>
                 <w:rFonts w:ascii="Calibri" w:hAnsi="Calibri"/>
-                <w:b w:val="0"/>
-                <w:sz w:val="22"/>
-              </w:rPr>
-              <w:t>No se eliminaron actividades. Se ajustaron: (1) la seguridad base se adelantó desde el Sprint 6 por el riesgo detectado; (2) el Sprint 1 se extendió una semana; (3) los sprints restantes se comprimieron a una semana y se agruparon épicas afines, porque el informe final se entrega el 06-11, antes de la semana 15 prevista en la Gantt; (4) el despliegue quedó 100% en Vercel, con Docker como entorno de pruebas; (5) el duelo S.K.A.T.E. se reconstruye en el sprint de gamificación; (6) las secciones en inglés quedan fuera, por definirlas el docente como opcionales.</w:t>
+              </w:rPr>
+              <w:t xml:space="preserve">No se eliminaron actividades. Se ajustaron: (1) la seguridad base se adelantó desde el Sprint 6 por el riesgo detectado; (2) el Sprint 1 se extendió una semana; (3) los </w:t>
+            </w:r>
+            <w:proofErr w:type="spellStart"/>
+            <w:r>
+              <w:rPr>
+                <w:rFonts w:ascii="Calibri" w:hAnsi="Calibri"/>
+              </w:rPr>
+              <w:t>sprints</w:t>
+            </w:r>
+            <w:proofErr w:type="spellEnd"/>
+            <w:r>
+              <w:rPr>
+                <w:rFonts w:ascii="Calibri" w:hAnsi="Calibri"/>
+              </w:rPr>
+              <w:t xml:space="preserve"> restantes se comprimieron a una semana y se agruparon épicas afines, porque el informe final se entrega el 06-11, antes de la semana 15 prevista en la Gantt; (4) el despliegue quedó 100% en </w:t>
+            </w:r>
+            <w:proofErr w:type="spellStart"/>
+            <w:r>
+              <w:rPr>
+                <w:rFonts w:ascii="Calibri" w:hAnsi="Calibri"/>
+              </w:rPr>
+              <w:t>Vercel</w:t>
+            </w:r>
+            <w:proofErr w:type="spellEnd"/>
+            <w:r>
+              <w:rPr>
+                <w:rFonts w:ascii="Calibri" w:hAnsi="Calibri"/>
+              </w:rPr>
+              <w:t>, con Docker como entorno de pruebas; (5) el duelo S.K.A.T.E. se reconstruye en el sprint de gamificación; (6) las secciones en inglés quedan fuera, por definirlas el docente como opcionales.</w:t>
             </w:r>
           </w:p>
         </w:tc>
@@ -3029,12 +3338,10 @@
             <w:vAlign w:val="center"/>
           </w:tcPr>
           <w:p>
-            <w:r/>
             <w:r>
               <w:rPr>
                 <w:rFonts w:ascii="Calibri" w:hAnsi="Calibri"/>
                 <w:b/>
-                <w:sz w:val="22"/>
               </w:rPr>
               <w:t>Actividades que no has iniciado o están retrasadas:</w:t>
             </w:r>
@@ -3046,8 +3353,6 @@
             <w:r>
               <w:rPr>
                 <w:rFonts w:ascii="Calibri" w:hAnsi="Calibri"/>
-                <w:b w:val="0"/>
-                <w:sz w:val="22"/>
               </w:rPr>
               <w:t>Están pendientes, sin afectar la fecha final: el criterio de HDU-04 (manejar el fallo de envío del correo de recuperación), la evaluación económica (VAN, TIR, ROI), el documento formal del plan de seguridad y las pruebas de integración y rendimiento. El motivo fue priorizar la seguridad base y el producto durante el Sprint 1.</w:t>
             </w:r>
@@ -3059,9 +3364,8 @@
             <w:r>
               <w:rPr>
                 <w:rFonts w:ascii="Calibri" w:hAnsi="Calibri"/>
-                <w:b w:val="0"/>
-                <w:sz w:val="22"/>
-              </w:rPr>
+              </w:rPr>
+              <w:lastRenderedPageBreak/>
               <w:t>Estrategia: HDU-04 se cierra en el Sprint 2; las pruebas de integración se escriben dentro de cada sprint; la evaluación económica y el plan de seguridad se desarrollan en el Sprint 5 (02-11 a 06-11), con responsables asignados, para incluirlos en el informe final.</w:t>
             </w:r>
           </w:p>
@@ -3087,7 +3391,7 @@
 </file>
 
 <file path=word/endnotes.xml><?xml version="1.0" encoding="utf-8"?>
-<w:endnotes xmlns:wpc="http://schemas.microsoft.com/office/word/2010/wordprocessingCanvas" xmlns:cx="http://schemas.microsoft.com/office/drawing/2014/chartex" xmlns:mc="http://schemas.openxmlformats.org/markup-compatibility/2006" xmlns:o="urn:schemas-microsoft-com:office:office" xmlns:r="http://schemas.openxmlformats.org/officeDocument/2006/relationships" xmlns:m="http://schemas.openxmlformats.org/officeDocument/2006/math" xmlns:v="urn:schemas-microsoft-com:vml" xmlns:wp14="http://schemas.microsoft.com/office/word/2010/wordprocessingDrawing" xmlns:wp="http://schemas.openxmlformats.org/drawingml/2006/wordprocessingDrawing" xmlns:w10="urn:schemas-microsoft-com:office:word" xmlns:w="http://schemas.openxmlformats.org/wordprocessingml/2006/main" xmlns:w14="http://schemas.microsoft.com/office/word/2010/wordml" xmlns:w15="http://schemas.microsoft.com/office/word/2012/wordml" xmlns:w16se="http://schemas.microsoft.com/office/word/2015/wordml/symex" xmlns:wpg="http://schemas.microsoft.com/office/word/2010/wordprocessingGroup" xmlns:wpi="http://schemas.microsoft.com/office/word/2010/wordprocessingInk" xmlns:wne="http://schemas.microsoft.com/office/word/2006/wordml" xmlns:wps="http://schemas.microsoft.com/office/word/2010/wordprocessingShape" mc:Ignorable="w14 w15 w16se wp14">
+<w:endnotes xmlns:wpc="http://schemas.microsoft.com/office/word/2010/wordprocessingCanvas" xmlns:cx="http://schemas.microsoft.com/office/drawing/2014/chartex" xmlns:cx1="http://schemas.microsoft.com/office/drawing/2015/9/8/chartex" xmlns:cx2="http://schemas.microsoft.com/office/drawing/2015/10/21/chartex" xmlns:cx3="http://schemas.microsoft.com/office/drawing/2016/5/9/chartex" xmlns:cx4="http://schemas.microsoft.com/office/drawing/2016/5/10/chartex" xmlns:cx5="http://schemas.microsoft.com/office/drawing/2016/5/11/chartex" xmlns:cx6="http://schemas.microsoft.com/office/drawing/2016/5/12/chartex" xmlns:cx7="http://schemas.microsoft.com/office/drawing/2016/5/13/chartex" xmlns:cx8="http://schemas.microsoft.com/office/drawing/2016/5/14/chartex" xmlns:mc="http://schemas.openxmlformats.org/markup-compatibility/2006" xmlns:aink="http://schemas.microsoft.com/office/drawing/2016/ink" xmlns:am3d="http://schemas.microsoft.com/office/drawing/2017/model3d" xmlns:o="urn:schemas-microsoft-com:office:office" xmlns:oel="http://schemas.microsoft.com/office/2019/extlst" xmlns:r="http://schemas.openxmlformats.org/officeDocument/2006/relationships" xmlns:m="http://schemas.openxmlformats.org/officeDocument/2006/math" xmlns:v="urn:schemas-microsoft-com:vml" xmlns:wp14="http://schemas.microsoft.com/office/word/2010/wordprocessingDrawing" xmlns:wp="http://schemas.openxmlformats.org/drawingml/2006/wordprocessingDrawing" xmlns:w10="urn:schemas-microsoft-com:office:word" xmlns:w="http://schemas.openxmlformats.org/wordprocessingml/2006/main" xmlns:w14="http://schemas.microsoft.com/office/word/2010/wordml" xmlns:w15="http://schemas.microsoft.com/office/word/2012/wordml" xmlns:w16cex="http://schemas.microsoft.com/office/word/2018/wordml/cex" xmlns:w16cid="http://schemas.microsoft.com/office/word/2016/wordml/cid" xmlns:w16="http://schemas.microsoft.com/office/word/2018/wordml" xmlns:w16du="http://schemas.microsoft.com/office/word/2023/wordml/word16du" xmlns:w16sdtdh="http://schemas.microsoft.com/office/word/2020/wordml/sdtdatahash" xmlns:w16sdtfl="http://schemas.microsoft.com/office/word/2024/wordml/sdtformatlock" xmlns:w16se="http://schemas.microsoft.com/office/word/2015/wordml/symex" xmlns:wpg="http://schemas.microsoft.com/office/word/2010/wordprocessingGroup" xmlns:wpi="http://schemas.microsoft.com/office/word/2010/wordprocessingInk" xmlns:wne="http://schemas.microsoft.com/office/word/2006/wordml" xmlns:wps="http://schemas.microsoft.com/office/word/2010/wordprocessingShape" mc:Ignorable="w14 w15 w16se w16cid w16 w16cex w16sdtdh w16sdtfl w16du wp14">
   <w:endnote w:type="separator" w:id="-1">
     <w:p>
       <w:pPr>
@@ -3112,7 +3416,7 @@
 </file>
 
 <file path=word/footnotes.xml><?xml version="1.0" encoding="utf-8"?>
-<w:footnotes xmlns:wpc="http://schemas.microsoft.com/office/word/2010/wordprocessingCanvas" xmlns:cx="http://schemas.microsoft.com/office/drawing/2014/chartex" xmlns:mc="http://schemas.openxmlformats.org/markup-compatibility/2006" xmlns:o="urn:schemas-microsoft-com:office:office" xmlns:r="http://schemas.openxmlformats.org/officeDocument/2006/relationships" xmlns:m="http://schemas.openxmlformats.org/officeDocument/2006/math" xmlns:v="urn:schemas-microsoft-com:vml" xmlns:wp14="http://schemas.microsoft.com/office/word/2010/wordprocessingDrawing" xmlns:wp="http://schemas.openxmlformats.org/drawingml/2006/wordprocessingDrawing" xmlns:w10="urn:schemas-microsoft-com:office:word" xmlns:w="http://schemas.openxmlformats.org/wordprocessingml/2006/main" xmlns:w14="http://schemas.microsoft.com/office/word/2010/wordml" xmlns:w15="http://schemas.microsoft.com/office/word/2012/wordml" xmlns:w16se="http://schemas.microsoft.com/office/word/2015/wordml/symex" xmlns:wpg="http://schemas.microsoft.com/office/word/2010/wordprocessingGroup" xmlns:wpi="http://schemas.microsoft.com/office/word/2010/wordprocessingInk" xmlns:wne="http://schemas.microsoft.com/office/word/2006/wordml" xmlns:wps="http://schemas.microsoft.com/office/word/2010/wordprocessingShape" mc:Ignorable="w14 w15 w16se wp14">
+<w:footnotes xmlns:wpc="http://schemas.microsoft.com/office/word/2010/wordprocessingCanvas" xmlns:cx="http://schemas.microsoft.com/office/drawing/2014/chartex" xmlns:cx1="http://schemas.microsoft.com/office/drawing/2015/9/8/chartex" xmlns:cx2="http://schemas.microsoft.com/office/drawing/2015/10/21/chartex" xmlns:cx3="http://schemas.microsoft.com/office/drawing/2016/5/9/chartex" xmlns:cx4="http://schemas.microsoft.com/office/drawing/2016/5/10/chartex" xmlns:cx5="http://schemas.microsoft.com/office/drawing/2016/5/11/chartex" xmlns:cx6="http://schemas.microsoft.com/office/drawing/2016/5/12/chartex" xmlns:cx7="http://schemas.microsoft.com/office/drawing/2016/5/13/chartex" xmlns:cx8="http://schemas.microsoft.com/office/drawing/2016/5/14/chartex" xmlns:mc="http://schemas.openxmlformats.org/markup-compatibility/2006" xmlns:aink="http://schemas.microsoft.com/office/drawing/2016/ink" xmlns:am3d="http://schemas.microsoft.com/office/drawing/2017/model3d" xmlns:o="urn:schemas-microsoft-com:office:office" xmlns:oel="http://schemas.microsoft.com/office/2019/extlst" xmlns:r="http://schemas.openxmlformats.org/officeDocument/2006/relationships" xmlns:m="http://schemas.openxmlformats.org/officeDocument/2006/math" xmlns:v="urn:schemas-microsoft-com:vml" xmlns:wp14="http://schemas.microsoft.com/office/word/2010/wordprocessingDrawing" xmlns:wp="http://schemas.openxmlformats.org/drawingml/2006/wordprocessingDrawing" xmlns:w10="urn:schemas-microsoft-com:office:word" xmlns:w="http://schemas.openxmlformats.org/wordprocessingml/2006/main" xmlns:w14="http://schemas.microsoft.com/office/word/2010/wordml" xmlns:w15="http://schemas.microsoft.com/office/word/2012/wordml" xmlns:w16cex="http://schemas.microsoft.com/office/word/2018/wordml/cex" xmlns:w16cid="http://schemas.microsoft.com/office/word/2016/wordml/cid" xmlns:w16="http://schemas.microsoft.com/office/word/2018/wordml" xmlns:w16du="http://schemas.microsoft.com/office/word/2023/wordml/word16du" xmlns:w16sdtdh="http://schemas.microsoft.com/office/word/2020/wordml/sdtdatahash" xmlns:w16sdtfl="http://schemas.microsoft.com/office/word/2024/wordml/sdtformatlock" xmlns:w16se="http://schemas.microsoft.com/office/word/2015/wordml/symex" xmlns:wpg="http://schemas.microsoft.com/office/word/2010/wordprocessingGroup" xmlns:wpi="http://schemas.microsoft.com/office/word/2010/wordprocessingInk" xmlns:wne="http://schemas.microsoft.com/office/word/2006/wordml" xmlns:wps="http://schemas.microsoft.com/office/word/2010/wordprocessingShape" mc:Ignorable="w14 w15 w16se w16cid w16 w16cex w16sdtdh w16sdtfl w16du wp14">
   <w:footnote w:type="separator" w:id="-1">
     <w:p>
       <w:pPr>
@@ -3195,7 +3499,7 @@
 </file>
 
 <file path=word/header1.xml><?xml version="1.0" encoding="utf-8"?>
-<w:hdr xmlns:wpc="http://schemas.microsoft.com/office/word/2010/wordprocessingCanvas" xmlns:cx="http://schemas.microsoft.com/office/drawing/2014/chartex" xmlns:mc="http://schemas.openxmlformats.org/markup-compatibility/2006" xmlns:o="urn:schemas-microsoft-com:office:office" xmlns:r="http://schemas.openxmlformats.org/officeDocument/2006/relationships" xmlns:m="http://schemas.openxmlformats.org/officeDocument/2006/math" xmlns:v="urn:schemas-microsoft-com:vml" xmlns:wp14="http://schemas.microsoft.com/office/word/2010/wordprocessingDrawing" xmlns:wp="http://schemas.openxmlformats.org/drawingml/2006/wordprocessingDrawing" xmlns:w10="urn:schemas-microsoft-com:office:word" xmlns:w="http://schemas.openxmlformats.org/wordprocessingml/2006/main" xmlns:w14="http://schemas.microsoft.com/office/word/2010/wordml" xmlns:w15="http://schemas.microsoft.com/office/word/2012/wordml" xmlns:w16se="http://schemas.microsoft.com/office/word/2015/wordml/symex" xmlns:wpg="http://schemas.microsoft.com/office/word/2010/wordprocessingGroup" xmlns:wpi="http://schemas.microsoft.com/office/word/2010/wordprocessingInk" xmlns:wne="http://schemas.microsoft.com/office/word/2006/wordml" xmlns:wps="http://schemas.microsoft.com/office/word/2010/wordprocessingShape" mc:Ignorable="w14 w15 w16se wp14">
+<w:hdr xmlns:wpc="http://schemas.microsoft.com/office/word/2010/wordprocessingCanvas" xmlns:cx="http://schemas.microsoft.com/office/drawing/2014/chartex" xmlns:cx1="http://schemas.microsoft.com/office/drawing/2015/9/8/chartex" xmlns:cx2="http://schemas.microsoft.com/office/drawing/2015/10/21/chartex" xmlns:cx3="http://schemas.microsoft.com/office/drawing/2016/5/9/chartex" xmlns:cx4="http://schemas.microsoft.com/office/drawing/2016/5/10/chartex" xmlns:cx5="http://schemas.microsoft.com/office/drawing/2016/5/11/chartex" xmlns:cx6="http://schemas.microsoft.com/office/drawing/2016/5/12/chartex" xmlns:cx7="http://schemas.microsoft.com/office/drawing/2016/5/13/chartex" xmlns:cx8="http://schemas.microsoft.com/office/drawing/2016/5/14/chartex" xmlns:mc="http://schemas.openxmlformats.org/markup-compatibility/2006" xmlns:aink="http://schemas.microsoft.com/office/drawing/2016/ink" xmlns:am3d="http://schemas.microsoft.com/office/drawing/2017/model3d" xmlns:o="urn:schemas-microsoft-com:office:office" xmlns:oel="http://schemas.microsoft.com/office/2019/extlst" xmlns:r="http://schemas.openxmlformats.org/officeDocument/2006/relationships" xmlns:m="http://schemas.openxmlformats.org/officeDocument/2006/math" xmlns:v="urn:schemas-microsoft-com:vml" xmlns:wp14="http://schemas.microsoft.com/office/word/2010/wordprocessingDrawing" xmlns:wp="http://schemas.openxmlformats.org/drawingml/2006/wordprocessingDrawing" xmlns:w10="urn:schemas-microsoft-com:office:word" xmlns:w="http://schemas.openxmlformats.org/wordprocessingml/2006/main" xmlns:w14="http://schemas.microsoft.com/office/word/2010/wordml" xmlns:w15="http://schemas.microsoft.com/office/word/2012/wordml" xmlns:w16cex="http://schemas.microsoft.com/office/word/2018/wordml/cex" xmlns:w16cid="http://schemas.microsoft.com/office/word/2016/wordml/cid" xmlns:w16="http://schemas.microsoft.com/office/word/2018/wordml" xmlns:w16du="http://schemas.microsoft.com/office/word/2023/wordml/word16du" xmlns:w16sdtdh="http://schemas.microsoft.com/office/word/2020/wordml/sdtdatahash" xmlns:w16sdtfl="http://schemas.microsoft.com/office/word/2024/wordml/sdtformatlock" xmlns:w16se="http://schemas.microsoft.com/office/word/2015/wordml/symex" xmlns:wpg="http://schemas.microsoft.com/office/word/2010/wordprocessingGroup" xmlns:wpi="http://schemas.microsoft.com/office/word/2010/wordprocessingInk" xmlns:wne="http://schemas.microsoft.com/office/word/2006/wordml" xmlns:wps="http://schemas.microsoft.com/office/word/2010/wordprocessingShape" mc:Ignorable="w14 w15 w16se w16cid w16 w16cex w16sdtdh w16sdtfl w16du wp14">
   <w:tbl>
     <w:tblPr>
       <w:tblStyle w:val="Tablaconcuadrcula1"/>
@@ -3420,7 +3724,7 @@
 </file>
 
 <file path=word/numbering.xml><?xml version="1.0" encoding="utf-8"?>
-<w:numbering xmlns:wpc="http://schemas.microsoft.com/office/word/2010/wordprocessingCanvas" xmlns:cx="http://schemas.microsoft.com/office/drawing/2014/chartex" xmlns:mc="http://schemas.openxmlformats.org/markup-compatibility/2006" xmlns:o="urn:schemas-microsoft-com:office:office" xmlns:r="http://schemas.openxmlformats.org/officeDocument/2006/relationships" xmlns:m="http://schemas.openxmlformats.org/officeDocument/2006/math" xmlns:v="urn:schemas-microsoft-com:vml" xmlns:wp14="http://schemas.microsoft.com/office/word/2010/wordprocessingDrawing" xmlns:wp="http://schemas.openxmlformats.org/drawingml/2006/wordprocessingDrawing" xmlns:w10="urn:schemas-microsoft-com:office:word" xmlns:w="http://schemas.openxmlformats.org/wordprocessingml/2006/main" xmlns:w14="http://schemas.microsoft.com/office/word/2010/wordml" xmlns:w15="http://schemas.microsoft.com/office/word/2012/wordml" xmlns:w16se="http://schemas.microsoft.com/office/word/2015/wordml/symex" xmlns:wpg="http://schemas.microsoft.com/office/word/2010/wordprocessingGroup" xmlns:wpi="http://schemas.microsoft.com/office/word/2010/wordprocessingInk" xmlns:wne="http://schemas.microsoft.com/office/word/2006/wordml" xmlns:wps="http://schemas.microsoft.com/office/word/2010/wordprocessingShape" mc:Ignorable="w14 w15 w16se wp14">
+<w:numbering xmlns:wpc="http://schemas.microsoft.com/office/word/2010/wordprocessingCanvas" xmlns:cx="http://schemas.microsoft.com/office/drawing/2014/chartex" xmlns:cx1="http://schemas.microsoft.com/office/drawing/2015/9/8/chartex" xmlns:cx2="http://schemas.microsoft.com/office/drawing/2015/10/21/chartex" xmlns:cx3="http://schemas.microsoft.com/office/drawing/2016/5/9/chartex" xmlns:cx4="http://schemas.microsoft.com/office/drawing/2016/5/10/chartex" xmlns:cx5="http://schemas.microsoft.com/office/drawing/2016/5/11/chartex" xmlns:cx6="http://schemas.microsoft.com/office/drawing/2016/5/12/chartex" xmlns:cx7="http://schemas.microsoft.com/office/drawing/2016/5/13/chartex" xmlns:cx8="http://schemas.microsoft.com/office/drawing/2016/5/14/chartex" xmlns:mc="http://schemas.openxmlformats.org/markup-compatibility/2006" xmlns:aink="http://schemas.microsoft.com/office/drawing/2016/ink" xmlns:am3d="http://schemas.microsoft.com/office/drawing/2017/model3d" xmlns:o="urn:schemas-microsoft-com:office:office" xmlns:oel="http://schemas.microsoft.com/office/2019/extlst" xmlns:r="http://schemas.openxmlformats.org/officeDocument/2006/relationships" xmlns:m="http://schemas.openxmlformats.org/officeDocument/2006/math" xmlns:v="urn:schemas-microsoft-com:vml" xmlns:wp14="http://schemas.microsoft.com/office/word/2010/wordprocessingDrawing" xmlns:wp="http://schemas.openxmlformats.org/drawingml/2006/wordprocessingDrawing" xmlns:w10="urn:schemas-microsoft-com:office:word" xmlns:w="http://schemas.openxmlformats.org/wordprocessingml/2006/main" xmlns:w14="http://schemas.microsoft.com/office/word/2010/wordml" xmlns:w15="http://schemas.microsoft.com/office/word/2012/wordml" xmlns:w16cex="http://schemas.microsoft.com/office/word/2018/wordml/cex" xmlns:w16cid="http://schemas.microsoft.com/office/word/2016/wordml/cid" xmlns:w16="http://schemas.microsoft.com/office/word/2018/wordml" xmlns:w16du="http://schemas.microsoft.com/office/word/2023/wordml/word16du" xmlns:w16sdtdh="http://schemas.microsoft.com/office/word/2020/wordml/sdtdatahash" xmlns:w16sdtfl="http://schemas.microsoft.com/office/word/2024/wordml/sdtformatlock" xmlns:w16se="http://schemas.microsoft.com/office/word/2015/wordml/symex" xmlns:wpg="http://schemas.microsoft.com/office/word/2010/wordprocessingGroup" xmlns:wpi="http://schemas.microsoft.com/office/word/2010/wordprocessingInk" xmlns:wne="http://schemas.microsoft.com/office/word/2006/wordml" xmlns:wps="http://schemas.microsoft.com/office/word/2010/wordprocessingShape" mc:Ignorable="w14 w15 w16se w16cid w16 w16cex w16sdtdh w16sdtfl w16du wp14">
   <w:abstractNum w:abstractNumId="0" w15:restartNumberingAfterBreak="0">
     <w:nsid w:val="2FFD4C7F"/>
     <w:multiLevelType w:val="multilevel"/>
@@ -3542,14 +3846,14 @@
       </w:rPr>
     </w:lvl>
   </w:abstractNum>
-  <w:num w:numId="1">
+  <w:num w:numId="1" w16cid:durableId="285628615">
     <w:abstractNumId w:val="0"/>
   </w:num>
 </w:numbering>
 </file>
 
 <file path=word/styles.xml><?xml version="1.0" encoding="utf-8"?>
-<w:styles xmlns:mc="http://schemas.openxmlformats.org/markup-compatibility/2006" xmlns:r="http://schemas.openxmlformats.org/officeDocument/2006/relationships" xmlns:w="http://schemas.openxmlformats.org/wordprocessingml/2006/main" xmlns:w14="http://schemas.microsoft.com/office/word/2010/wordml" xmlns:w15="http://schemas.microsoft.com/office/word/2012/wordml" xmlns:w16se="http://schemas.microsoft.com/office/word/2015/wordml/symex" mc:Ignorable="w14 w15 w16se">
+<w:styles xmlns:mc="http://schemas.openxmlformats.org/markup-compatibility/2006" xmlns:r="http://schemas.openxmlformats.org/officeDocument/2006/relationships" xmlns:w="http://schemas.openxmlformats.org/wordprocessingml/2006/main" xmlns:w14="http://schemas.microsoft.com/office/word/2010/wordml" xmlns:w15="http://schemas.microsoft.com/office/word/2012/wordml" xmlns:w16cex="http://schemas.microsoft.com/office/word/2018/wordml/cex" xmlns:w16cid="http://schemas.microsoft.com/office/word/2016/wordml/cid" xmlns:w16="http://schemas.microsoft.com/office/word/2018/wordml" xmlns:w16du="http://schemas.microsoft.com/office/word/2023/wordml/word16du" xmlns:w16sdtdh="http://schemas.microsoft.com/office/word/2020/wordml/sdtdatahash" xmlns:w16sdtfl="http://schemas.microsoft.com/office/word/2024/wordml/sdtformatlock" xmlns:w16se="http://schemas.microsoft.com/office/word/2015/wordml/symex" mc:Ignorable="w14 w15 w16se w16cid w16 w16cex w16sdtdh w16sdtfl w16du">
   <w:docDefaults>
     <w:rPrDefault>
       <w:rPr>
@@ -3561,7 +3865,7 @@
     </w:rPrDefault>
     <w:pPrDefault/>
   </w:docDefaults>
-  <w:latentStyles w:defLockedState="0" w:defUIPriority="99" w:defSemiHidden="0" w:defUnhideWhenUsed="0" w:defQFormat="0" w:count="371">
+  <w:latentStyles w:defLockedState="0" w:defUIPriority="99" w:defSemiHidden="0" w:defUnhideWhenUsed="0" w:defQFormat="0" w:count="376">
     <w:lsdException w:name="Normal" w:uiPriority="0" w:qFormat="1"/>
     <w:lsdException w:name="heading 1" w:uiPriority="9" w:qFormat="1"/>
     <w:lsdException w:name="heading 2" w:semiHidden="1" w:uiPriority="9" w:unhideWhenUsed="1" w:qFormat="1"/>
@@ -3933,6 +4237,11 @@
     <w:lsdException w:name="List Table 5 Dark Accent 6" w:uiPriority="50"/>
     <w:lsdException w:name="List Table 6 Colorful Accent 6" w:uiPriority="51"/>
     <w:lsdException w:name="List Table 7 Colorful Accent 6" w:uiPriority="52"/>
+    <w:lsdException w:name="Mention" w:semiHidden="1" w:unhideWhenUsed="1"/>
+    <w:lsdException w:name="Smart Hyperlink" w:semiHidden="1" w:unhideWhenUsed="1"/>
+    <w:lsdException w:name="Hashtag" w:semiHidden="1" w:unhideWhenUsed="1"/>
+    <w:lsdException w:name="Unresolved Mention" w:semiHidden="1" w:unhideWhenUsed="1"/>
+    <w:lsdException w:name="Smart Link" w:semiHidden="1" w:unhideWhenUsed="1"/>
   </w:latentStyles>
   <w:style w:type="paragraph" w:default="1" w:styleId="Normal">
     <w:name w:val="Normal"/>
@@ -4535,9 +4844,12 @@
 </file>
 
 <file path=customXml/item1.xml><?xml version="1.0" encoding="utf-8"?>
-<p:properties xmlns:p="http://schemas.microsoft.com/office/2006/metadata/properties" xmlns:xsi="http://www.w3.org/2001/XMLSchema-instance" xmlns:pc="http://schemas.microsoft.com/office/infopath/2007/PartnerControls">
-  <documentManagement/>
-</p:properties>
+<?mso-contentType ?>
+<FormTemplates xmlns="http://schemas.microsoft.com/sharepoint/v3/contenttype/forms">
+  <Display>DocumentLibraryForm</Display>
+  <Edit>DocumentLibraryForm</Edit>
+  <New>DocumentLibraryForm</New>
+</FormTemplates>
 </file>
 
 <file path=customXml/item2.xml><?xml version="1.0" encoding="utf-8"?>
@@ -4673,26 +4985,15 @@
 </file>
 
 <file path=customXml/item3.xml><?xml version="1.0" encoding="utf-8"?>
-<?mso-contentType ?>
-<FormTemplates xmlns="http://schemas.microsoft.com/sharepoint/v3/contenttype/forms">
-  <Display>DocumentLibraryForm</Display>
-  <Edit>DocumentLibraryForm</Edit>
-  <New>DocumentLibraryForm</New>
-</FormTemplates>
+<p:properties xmlns:p="http://schemas.microsoft.com/office/2006/metadata/properties" xmlns:xsi="http://www.w3.org/2001/XMLSchema-instance" xmlns:pc="http://schemas.microsoft.com/office/infopath/2007/PartnerControls">
+  <documentManagement/>
+</p:properties>
 </file>
 
 <file path=customXml/itemProps1.xml><?xml version="1.0" encoding="utf-8"?>
-<ds:datastoreItem xmlns:ds="http://schemas.openxmlformats.org/officeDocument/2006/customXml" ds:itemID="{46CA5683-AF87-4E40-B841-2E23A3B52406}">
+<ds:datastoreItem xmlns:ds="http://schemas.openxmlformats.org/officeDocument/2006/customXml" ds:itemID="{D51C61E4-DB75-4684-AD25-71F546404E96}">
   <ds:schemaRefs>
-    <ds:schemaRef ds:uri="http://purl.org/dc/terms/"/>
-    <ds:schemaRef ds:uri="http://purl.org/dc/elements/1.1/"/>
-    <ds:schemaRef ds:uri="http://schemas.openxmlformats.org/package/2006/metadata/core-properties"/>
-    <ds:schemaRef ds:uri="http://www.w3.org/XML/1998/namespace"/>
-    <ds:schemaRef ds:uri="http://schemas.microsoft.com/office/2006/metadata/properties"/>
-    <ds:schemaRef ds:uri="http://schemas.microsoft.com/office/2006/documentManagement/types"/>
-    <ds:schemaRef ds:uri="http://purl.org/dc/dcmitype/"/>
-    <ds:schemaRef ds:uri="http://schemas.microsoft.com/office/infopath/2007/PartnerControls"/>
-    <ds:schemaRef ds:uri="126e8a1c-9ea9-435a-ac89-d06c80d62e30"/>
+    <ds:schemaRef ds:uri="http://schemas.microsoft.com/sharepoint/v3/contenttype/forms"/>
   </ds:schemaRefs>
 </ds:datastoreItem>
 </file>
@@ -4716,9 +5017,10 @@
 </file>
 
 <file path=customXml/itemProps3.xml><?xml version="1.0" encoding="utf-8"?>
-<ds:datastoreItem xmlns:ds="http://schemas.openxmlformats.org/officeDocument/2006/customXml" ds:itemID="{D51C61E4-DB75-4684-AD25-71F546404E96}">
+<ds:datastoreItem xmlns:ds="http://schemas.openxmlformats.org/officeDocument/2006/customXml" ds:itemID="{46CA5683-AF87-4E40-B841-2E23A3B52406}">
   <ds:schemaRefs>
-    <ds:schemaRef ds:uri="http://schemas.microsoft.com/sharepoint/v3/contenttype/forms"/>
+    <ds:schemaRef ds:uri="http://schemas.microsoft.com/office/2006/metadata/properties"/>
+    <ds:schemaRef ds:uri="http://schemas.microsoft.com/office/infopath/2007/PartnerControls"/>
   </ds:schemaRefs>
 </ds:datastoreItem>
 </file>
</xml_diff>